<commit_message>
docs/update SRS document V1.3
</commit_message>
<xml_diff>
--- a/Process_Docs/SRS.docx
+++ b/Process_Docs/SRS.docx
@@ -149,6 +149,7 @@
           <w:docPartUnique/>
         </w:docPartObj>
       </w:sdtPr>
+      <w:sdtEndPr/>
       <w:sdtContent>
         <w:p>
           <w:pPr>
@@ -12639,7 +12640,19 @@
               <w:rPr>
                 <w:lang w:val="en-US"/>
               </w:rPr>
-              <w:t xml:space="preserve"> prevents proceeding to confirmation if </w:t>
+              <w:t xml:space="preserve"> prevents proceeding to </w:t>
+            </w:r>
+            <w:r>
+              <w:rPr>
+                <w:lang w:val="en-US"/>
+              </w:rPr>
+              <w:t>checkout</w:t>
+            </w:r>
+            <w:r>
+              <w:rPr>
+                <w:lang w:val="en-US"/>
+              </w:rPr>
+              <w:t xml:space="preserve"> if </w:t>
             </w:r>
             <w:r>
               <w:rPr>
@@ -12846,7 +12859,19 @@
               <w:rPr>
                 <w:lang w:val="en-US"/>
               </w:rPr>
-              <w:t xml:space="preserve">“Confirm Order” button is clearly visible and enabled on the confirmation page </w:t>
+              <w:t xml:space="preserve">“Confirm Order” button is clearly visible and enabled on the </w:t>
+            </w:r>
+            <w:r>
+              <w:rPr>
+                <w:lang w:val="en-US"/>
+              </w:rPr>
+              <w:t>checkout</w:t>
+            </w:r>
+            <w:r>
+              <w:rPr>
+                <w:lang w:val="en-US"/>
+              </w:rPr>
+              <w:t xml:space="preserve"> page </w:t>
             </w:r>
           </w:p>
           <w:p>
@@ -12883,55 +12908,6 @@
               <w:t>with a pop-up “Order is placed successfully” message and redirects to the Home Page</w:t>
             </w:r>
           </w:p>
-          <w:p>
-            <w:pPr>
-              <w:pStyle w:val="ListParagraph"/>
-              <w:widowControl w:val="0"/>
-              <w:numPr>
-                <w:ilvl w:val="0"/>
-                <w:numId w:val="31"/>
-              </w:numPr>
-              <w:pBdr>
-                <w:top w:val="nil"/>
-                <w:left w:val="nil"/>
-                <w:bottom w:val="nil"/>
-                <w:right w:val="nil"/>
-                <w:between w:val="nil"/>
-              </w:pBdr>
-              <w:spacing w:before="0" w:after="0" w:line="240" w:lineRule="auto"/>
-              <w:rPr>
-                <w:lang w:val="en-US"/>
-              </w:rPr>
-            </w:pPr>
-            <w:r>
-              <w:rPr>
-                <w:lang w:val="en-US"/>
-              </w:rPr>
-              <w:t>The button</w:t>
-            </w:r>
-            <w:r>
-              <w:rPr>
-                <w:lang w:val="en-US"/>
-              </w:rPr>
-              <w:t xml:space="preserve"> is disabled until all required fields are filled</w:t>
-            </w:r>
-          </w:p>
-          <w:p>
-            <w:pPr>
-              <w:widowControl w:val="0"/>
-              <w:pBdr>
-                <w:top w:val="nil"/>
-                <w:left w:val="nil"/>
-                <w:bottom w:val="nil"/>
-                <w:right w:val="nil"/>
-                <w:between w:val="nil"/>
-              </w:pBdr>
-              <w:spacing w:before="0" w:after="0" w:line="240" w:lineRule="auto"/>
-              <w:rPr>
-                <w:lang w:val="en-US"/>
-              </w:rPr>
-            </w:pPr>
-          </w:p>
         </w:tc>
         <w:tc>
           <w:tcPr>
@@ -13315,7 +13291,19 @@
               <w:rPr>
                 <w:lang w:val="en-US"/>
               </w:rPr>
-              <w:t>Only logged-in users can access the order confirmation pag</w:t>
+              <w:t xml:space="preserve">Only logged-in users can access the order </w:t>
+            </w:r>
+            <w:r>
+              <w:rPr>
+                <w:lang w:val="en-US"/>
+              </w:rPr>
+              <w:t>checkout</w:t>
+            </w:r>
+            <w:r>
+              <w:rPr>
+                <w:lang w:val="en-US"/>
+              </w:rPr>
+              <w:t xml:space="preserve"> pag</w:t>
             </w:r>
             <w:r>
               <w:rPr>
@@ -13705,11 +13693,7 @@
               <w:spacing w:before="0" w:after="0"/>
             </w:pPr>
             <w:r>
-              <w:t>SRS-FN-</w:t>
-            </w:r>
-            <w:r>
-              <w:lastRenderedPageBreak/>
-              <w:t>Profile-002</w:t>
+              <w:t>SRS-FN-Profile-002</w:t>
             </w:r>
           </w:p>
         </w:tc>
@@ -13739,15 +13723,10 @@
               </w:rPr>
             </w:pPr>
             <w:r>
-              <w:lastRenderedPageBreak/>
               <w:t>t</w:t>
             </w:r>
             <w:r>
-              <w:t xml:space="preserve">he system SHALL allow users to </w:t>
-            </w:r>
-            <w:r>
-              <w:lastRenderedPageBreak/>
-              <w:t>update their Username only.</w:t>
+              <w:t>he system SHALL allow users to update their Username only.</w:t>
             </w:r>
           </w:p>
         </w:tc>
@@ -13768,7 +13747,6 @@
               <w:spacing w:before="0" w:after="0" w:line="240" w:lineRule="auto"/>
             </w:pPr>
             <w:r>
-              <w:lastRenderedPageBreak/>
               <w:t>Functional</w:t>
             </w:r>
           </w:p>
@@ -13819,11 +13797,7 @@
               </w:rPr>
             </w:pPr>
             <w:r>
-              <w:t xml:space="preserve">The Email field is read-only; the </w:t>
-            </w:r>
-            <w:r>
-              <w:lastRenderedPageBreak/>
-              <w:t>Username field is editable.</w:t>
+              <w:t>The Email field is read-only; the Username field is editable.</w:t>
             </w:r>
           </w:p>
           <w:p>
@@ -13860,7 +13834,6 @@
               <w:spacing w:before="0" w:after="0" w:line="240" w:lineRule="auto"/>
             </w:pPr>
             <w:r>
-              <w:lastRenderedPageBreak/>
               <w:t>In Review</w:t>
             </w:r>
           </w:p>
@@ -20900,6 +20873,7 @@
   <w:style w:type="character" w:default="1" w:styleId="DefaultParagraphFont">
     <w:name w:val="Default Paragraph Font"/>
     <w:uiPriority w:val="1"/>
+    <w:semiHidden/>
     <w:unhideWhenUsed/>
   </w:style>
   <w:style w:type="table" w:default="1" w:styleId="TableNormal">

</xml_diff>

<commit_message>
write bugs in admin ,profile pages
</commit_message>
<xml_diff>
--- a/Process_Docs/SRS.docx
+++ b/Process_Docs/SRS.docx
@@ -1,6 +1,6 @@
 
 <file path=word/document.xml><?xml version="1.0" encoding="utf-8"?>
-<w:document xmlns:wpc="http://schemas.microsoft.com/office/word/2010/wordprocessingCanvas" xmlns:cx="http://schemas.microsoft.com/office/drawing/2014/chartex" xmlns:cx1="http://schemas.microsoft.com/office/drawing/2015/9/8/chartex" xmlns:cx2="http://schemas.microsoft.com/office/drawing/2015/10/21/chartex" xmlns:cx3="http://schemas.microsoft.com/office/drawing/2016/5/9/chartex" xmlns:cx4="http://schemas.microsoft.com/office/drawing/2016/5/10/chartex" xmlns:cx5="http://schemas.microsoft.com/office/drawing/2016/5/11/chartex" xmlns:cx6="http://schemas.microsoft.com/office/drawing/2016/5/12/chartex" xmlns:cx7="http://schemas.microsoft.com/office/drawing/2016/5/13/chartex" xmlns:cx8="http://schemas.microsoft.com/office/drawing/2016/5/14/chartex" xmlns:mc="http://schemas.openxmlformats.org/markup-compatibility/2006" xmlns:aink="http://schemas.microsoft.com/office/drawing/2016/ink" xmlns:am3d="http://schemas.microsoft.com/office/drawing/2017/model3d" xmlns:o="urn:schemas-microsoft-com:office:office" xmlns:oel="http://schemas.microsoft.com/office/2019/extlst" xmlns:r="http://schemas.openxmlformats.org/officeDocument/2006/relationships" xmlns:m="http://schemas.openxmlformats.org/officeDocument/2006/math" xmlns:v="urn:schemas-microsoft-com:vml" xmlns:wp14="http://schemas.microsoft.com/office/word/2010/wordprocessingDrawing" xmlns:wp="http://schemas.openxmlformats.org/drawingml/2006/wordprocessingDrawing" xmlns:w10="urn:schemas-microsoft-com:office:word" xmlns:w="http://schemas.openxmlformats.org/wordprocessingml/2006/main" xmlns:w14="http://schemas.microsoft.com/office/word/2010/wordml" xmlns:w15="http://schemas.microsoft.com/office/word/2012/wordml" xmlns:w16cex="http://schemas.microsoft.com/office/word/2018/wordml/cex" xmlns:w16cid="http://schemas.microsoft.com/office/word/2016/wordml/cid" xmlns:w16="http://schemas.microsoft.com/office/word/2018/wordml" xmlns:w16du="http://schemas.microsoft.com/office/word/2023/wordml/word16du" xmlns:w16sdtdh="http://schemas.microsoft.com/office/word/2020/wordml/sdtdatahash" xmlns:w16sdtfl="http://schemas.microsoft.com/office/word/2024/wordml/sdtformatlock" xmlns:w16se="http://schemas.microsoft.com/office/word/2015/wordml/symex" xmlns:wpg="http://schemas.microsoft.com/office/word/2010/wordprocessingGroup" xmlns:wpi="http://schemas.microsoft.com/office/word/2010/wordprocessingInk" xmlns:wne="http://schemas.microsoft.com/office/word/2006/wordml" xmlns:wps="http://schemas.microsoft.com/office/word/2010/wordprocessingShape" mc:Ignorable="w14 w15 w16se w16cid w16 w16cex w16sdtdh w16sdtfl w16du wp14">
+<w:document xmlns:wpc="http://schemas.microsoft.com/office/word/2010/wordprocessingCanvas" xmlns:mc="http://schemas.openxmlformats.org/markup-compatibility/2006" xmlns:o="urn:schemas-microsoft-com:office:office" xmlns:r="http://schemas.openxmlformats.org/officeDocument/2006/relationships" xmlns:m="http://schemas.openxmlformats.org/officeDocument/2006/math" xmlns:v="urn:schemas-microsoft-com:vml" xmlns:wp14="http://schemas.microsoft.com/office/word/2010/wordprocessingDrawing" xmlns:wp="http://schemas.openxmlformats.org/drawingml/2006/wordprocessingDrawing" xmlns:w10="urn:schemas-microsoft-com:office:word" xmlns:w="http://schemas.openxmlformats.org/wordprocessingml/2006/main" xmlns:w14="http://schemas.microsoft.com/office/word/2010/wordml" xmlns:wpg="http://schemas.microsoft.com/office/word/2010/wordprocessingGroup" xmlns:wpi="http://schemas.microsoft.com/office/word/2010/wordprocessingInk" xmlns:wne="http://schemas.microsoft.com/office/word/2006/wordml" xmlns:wps="http://schemas.microsoft.com/office/word/2010/wordprocessingShape" mc:Ignorable="w14 wp14">
   <w:body>
     <w:p>
       <w:pPr>
@@ -128,6 +128,7 @@
           <w:docPartUnique/>
         </w:docPartObj>
       </w:sdtPr>
+      <w:sdtEndPr/>
       <w:sdtContent>
         <w:p>
           <w:pPr>
@@ -272,7 +273,13 @@
               <w:rPr>
                 <w:color w:val="000000"/>
               </w:rPr>
-              <w:t>1.3 Definitions, Acronyms, and Abbreviations</w:t>
+              <w:t xml:space="preserve">1.3 Definitions, Acronyms, and </w:t>
+            </w:r>
+            <w:r>
+              <w:rPr>
+                <w:color w:val="000000"/>
+              </w:rPr>
+              <w:t>Abbreviations</w:t>
             </w:r>
             <w:r>
               <w:rPr>
@@ -618,7 +625,13 @@
               <w:rPr>
                 <w:color w:val="000000"/>
               </w:rPr>
-              <w:t>3.3. Administrator Functions</w:t>
+              <w:t>3.3. Administrator Fu</w:t>
+            </w:r>
+            <w:r>
+              <w:rPr>
+                <w:color w:val="000000"/>
+              </w:rPr>
+              <w:t>nctions</w:t>
             </w:r>
             <w:r>
               <w:rPr>
@@ -730,7 +743,13 @@
               <w:rPr>
                 <w:color w:val="000000"/>
               </w:rPr>
-              <w:t>3.6. Order Processing</w:t>
+              <w:t xml:space="preserve">3.6. Order </w:t>
+            </w:r>
+            <w:r>
+              <w:rPr>
+                <w:color w:val="000000"/>
+              </w:rPr>
+              <w:t>Processing</w:t>
             </w:r>
             <w:r>
               <w:rPr>
@@ -1233,7 +1252,14 @@
           <w:sz w:val="34"/>
           <w:szCs w:val="34"/>
         </w:rPr>
-        <w:t>1.1 Document Purpose</w:t>
+        <w:t xml:space="preserve">1.1 Document </w:t>
+      </w:r>
+      <w:r>
+        <w:rPr>
+          <w:sz w:val="34"/>
+          <w:szCs w:val="34"/>
+        </w:rPr>
+        <w:t>Purpose</w:t>
       </w:r>
     </w:p>
     <w:p>
@@ -1246,23 +1272,10 @@
       </w:r>
       <w:proofErr w:type="spellEnd"/>
       <w:r>
-        <w:t xml:space="preserve">-Platform App, an online Shopping store for (Clothes, Accessories. This SRS </w:t>
-      </w:r>
-      <w:proofErr w:type="gramStart"/>
-      <w:r>
-        <w:t>servers</w:t>
-      </w:r>
-      <w:proofErr w:type="gramEnd"/>
-      <w:r>
-        <w:t xml:space="preserve"> as the primary document for </w:t>
-      </w:r>
-      <w:proofErr w:type="gramStart"/>
-      <w:r>
-        <w:t>developers</w:t>
-      </w:r>
-      <w:proofErr w:type="gramEnd"/>
-      <w:r>
-        <w:t xml:space="preserve"> team, testers team, project stakeholders, and the client to ensure that the final system meets all specified needs.</w:t>
+        <w:t>-Platform App, an online Shopping store for (Clothes, Accessories. This SRS servers as the primary document for developers team, testers t</w:t>
+      </w:r>
+      <w:r>
+        <w:t>eam, project stakeholders, and the client to ensure that the final system meets all specified needs.</w:t>
       </w:r>
     </w:p>
     <w:p>
@@ -1285,7 +1298,10 @@
     </w:p>
     <w:p>
       <w:r>
-        <w:t>Clothing Platform App will be an e-commerce platform that allows customers to browse products, manage a shopping cart, place orders, and track deliveries</w:t>
+        <w:t>Clothing Platform App will be an e-commerce platform that allows customers to browse products, manage a shopping cart, place orders, and</w:t>
+      </w:r>
+      <w:r>
+        <w:t xml:space="preserve"> track deliveries</w:t>
       </w:r>
     </w:p>
     <w:p>
@@ -1321,15 +1337,7 @@
         <w:spacing w:before="0" w:after="0"/>
       </w:pPr>
       <w:r>
-        <w:t>Registration page with (</w:t>
-      </w:r>
-      <w:proofErr w:type="gramStart"/>
-      <w:r>
-        <w:t>Name ,</w:t>
-      </w:r>
-      <w:proofErr w:type="gramEnd"/>
-      <w:r>
-        <w:t xml:space="preserve"> E-mail ‘As unique ID’, Password, Confirm-Password, Role Button)</w:t>
+        <w:t>Registration page with (Name , E-mail ‘As unique ID’, Password, Confirm-Password, Role Button)</w:t>
       </w:r>
     </w:p>
     <w:p>
@@ -1401,7 +1409,10 @@
         <w:spacing w:before="0" w:after="0"/>
       </w:pPr>
       <w:r>
-        <w:t>Admin Dashboard</w:t>
+        <w:t xml:space="preserve">Admin </w:t>
+      </w:r>
+      <w:r>
+        <w:t>Dashboard</w:t>
       </w:r>
     </w:p>
     <w:p>
@@ -1580,7 +1591,10 @@
               <w:spacing w:line="240" w:lineRule="auto"/>
             </w:pPr>
             <w:r>
-              <w:t>Description</w:t>
+              <w:t>Descripti</w:t>
+            </w:r>
+            <w:r>
+              <w:t>on</w:t>
             </w:r>
           </w:p>
         </w:tc>
@@ -1964,7 +1978,10 @@
               <w:spacing w:before="0" w:after="0" w:line="240" w:lineRule="auto"/>
             </w:pPr>
             <w:r>
-              <w:t>Cash on Delivery - Payment method where payment is collected after order delivery</w:t>
+              <w:t xml:space="preserve">Cash on Delivery - Payment method where payment is collected after </w:t>
+            </w:r>
+            <w:r>
+              <w:t>order delivery</w:t>
             </w:r>
           </w:p>
         </w:tc>
@@ -2005,7 +2022,7 @@
       <w:r>
         <w:t xml:space="preserve">This document template is aligned with IEEE 830 and ISO/IEC/IEEE 29148:2011/2017. And can be found at </w:t>
       </w:r>
-      <w:hyperlink r:id="rId7">
+      <w:hyperlink r:id="rId8">
         <w:r>
           <w:rPr>
             <w:color w:val="1155CC"/>
@@ -2040,7 +2057,10 @@
     </w:p>
     <w:p>
       <w:r>
-        <w:t>This document is organized as follows:</w:t>
+        <w:t>This document is organized as fo</w:t>
+      </w:r>
+      <w:r>
+        <w:t>llows:</w:t>
       </w:r>
     </w:p>
     <w:p>
@@ -2078,7 +2098,10 @@
         <w:t>Section 3 - Specific Requirement</w:t>
       </w:r>
       <w:r>
-        <w:t>s: Details all functional requirements organized by feature.</w:t>
+        <w:t xml:space="preserve">s: Details all functional requirements organized by </w:t>
+      </w:r>
+      <w:r>
+        <w:t>feature.</w:t>
       </w:r>
     </w:p>
     <w:p>
@@ -2178,7 +2201,10 @@
         <w:spacing w:after="200"/>
       </w:pPr>
       <w:r>
-        <w:t>The Clothing Web Portal is a web-based system designed to operate as an e-commerce solution. The system consists of the following major components:</w:t>
+        <w:t>The Clothing Web Portal is a web-based system designed to operate as an e-commerce solution. The system consists of the following major c</w:t>
+      </w:r>
+      <w:r>
+        <w:t>omponents:</w:t>
       </w:r>
     </w:p>
     <w:p>
@@ -2242,7 +2268,10 @@
         <w:t xml:space="preserve">Database System: </w:t>
       </w:r>
       <w:r>
-        <w:t>Stores user information, product list, orders, and orders history</w:t>
+        <w:t>Stores user information, product list, orders, and orders</w:t>
+      </w:r>
+      <w:r>
+        <w:t xml:space="preserve"> history</w:t>
       </w:r>
     </w:p>
     <w:p>
@@ -2308,7 +2337,10 @@
         <w:t xml:space="preserve">User Management: </w:t>
       </w:r>
       <w:r>
-        <w:t>Registration, authentication, and role-based access control for Clients, Suppliers, and Administrators</w:t>
+        <w:t xml:space="preserve">Registration, authentication, and role-based access control for Clients, </w:t>
+      </w:r>
+      <w:r>
+        <w:t>Suppliers, and Administrators</w:t>
       </w:r>
     </w:p>
     <w:p>
@@ -2346,13 +2378,8 @@
         <w:t xml:space="preserve">Shopping Cart: </w:t>
       </w:r>
       <w:r>
-        <w:t xml:space="preserve">Add products to cart, and proceed to </w:t>
-      </w:r>
-      <w:proofErr w:type="gramStart"/>
-      <w:r>
-        <w:t>checkout</w:t>
-      </w:r>
-      <w:proofErr w:type="gramEnd"/>
+        <w:t>Add products to cart, and proceed to checkout</w:t>
+      </w:r>
     </w:p>
     <w:p>
       <w:pPr>
@@ -2370,7 +2397,10 @@
         <w:t xml:space="preserve">Order Processing: </w:t>
       </w:r>
       <w:r>
-        <w:t>Place orders with cash-on-delivery payment and view order history</w:t>
+        <w:t>Place orders with cash-on-delivery payment and view order</w:t>
+      </w:r>
+      <w:r>
+        <w:t xml:space="preserve"> history</w:t>
       </w:r>
     </w:p>
     <w:p>
@@ -2454,7 +2484,14 @@
           <w:sz w:val="34"/>
           <w:szCs w:val="34"/>
         </w:rPr>
-        <w:t>2.3 Product Constraints</w:t>
+        <w:t xml:space="preserve">2.3 </w:t>
+      </w:r>
+      <w:r>
+        <w:rPr>
+          <w:sz w:val="34"/>
+          <w:szCs w:val="34"/>
+        </w:rPr>
+        <w:t>Product Constraints</w:t>
       </w:r>
     </w:p>
     <w:p>
@@ -2511,7 +2548,10 @@
         <w:t xml:space="preserve">Admin Features Required: </w:t>
       </w:r>
       <w:r>
-        <w:t>System must have admin controls for users, suppliers and products management</w:t>
+        <w:t>System must have admin contr</w:t>
+      </w:r>
+      <w:r>
+        <w:t>ols for users, suppliers and products management</w:t>
       </w:r>
     </w:p>
     <w:p>
@@ -2575,7 +2615,14 @@
           <w:b/>
           <w:bCs/>
         </w:rPr>
-        <w:t xml:space="preserve">English Language Only: </w:t>
+        <w:t>English Langua</w:t>
+      </w:r>
+      <w:r>
+        <w:rPr>
+          <w:b/>
+          <w:bCs/>
+        </w:rPr>
+        <w:t xml:space="preserve">ge Only: </w:t>
       </w:r>
       <w:r>
         <w:t>All user interfaces must be in English</w:t>
@@ -2666,7 +2713,14 @@
           <w:b/>
           <w:bCs/>
         </w:rPr>
-        <w:t xml:space="preserve">Client (Customer): </w:t>
+        <w:t>Client (Custom</w:t>
+      </w:r>
+      <w:r>
+        <w:rPr>
+          <w:b/>
+          <w:bCs/>
+        </w:rPr>
+        <w:t xml:space="preserve">er): </w:t>
       </w:r>
       <w:r>
         <w:t>Browse and purchase clothing and accessories</w:t>
@@ -2844,7 +2898,10 @@
             <w:bookmarkStart w:id="15" w:name="_j252vzvas3ua" w:colFirst="0" w:colLast="0"/>
             <w:bookmarkEnd w:id="15"/>
             <w:r>
-              <w:t>3. Functional Requirements</w:t>
+              <w:t>3. Functional Requ</w:t>
+            </w:r>
+            <w:r>
+              <w:t>irements</w:t>
             </w:r>
           </w:p>
         </w:tc>
@@ -2993,19 +3050,11 @@
               <w:spacing w:before="0" w:after="0"/>
             </w:pPr>
             <w:r>
-              <w:t xml:space="preserve">The system SHALL </w:t>
+              <w:t>The system SHALL provide a registration page with (Username</w:t>
             </w:r>
             <w:proofErr w:type="gramStart"/>
             <w:r>
-              <w:t>provide</w:t>
-            </w:r>
-            <w:proofErr w:type="gramEnd"/>
-            <w:r>
-              <w:t xml:space="preserve"> a registration page with (</w:t>
-            </w:r>
-            <w:proofErr w:type="gramStart"/>
-            <w:r>
-              <w:t>Username,  Email</w:t>
+              <w:t>,  Email</w:t>
             </w:r>
             <w:proofErr w:type="gramEnd"/>
             <w:r>
@@ -3057,21 +3106,11 @@
               </w:pBdr>
               <w:spacing w:before="0" w:after="0"/>
             </w:pPr>
-            <w:proofErr w:type="gramStart"/>
-            <w:r>
-              <w:t>The system SHALL</w:t>
-            </w:r>
-            <w:proofErr w:type="gramEnd"/>
-            <w:r>
-              <w:t xml:space="preserve"> </w:t>
-            </w:r>
-            <w:proofErr w:type="gramStart"/>
-            <w:r>
-              <w:t>provide</w:t>
-            </w:r>
-            <w:proofErr w:type="gramEnd"/>
-            <w:r>
-              <w:t xml:space="preserve"> password visibility toggle option for password field</w:t>
+            <w:r>
+              <w:t xml:space="preserve">The system </w:t>
+            </w:r>
+            <w:r>
+              <w:t>SHALL provide password visibility toggle option for password field</w:t>
             </w:r>
           </w:p>
         </w:tc>
@@ -3120,29 +3159,8 @@
               </w:pBdr>
               <w:spacing w:before="0" w:after="0"/>
             </w:pPr>
-            <w:proofErr w:type="gramStart"/>
-            <w:r>
-              <w:t>The system SHALL</w:t>
-            </w:r>
-            <w:proofErr w:type="gramEnd"/>
-            <w:r>
-              <w:t xml:space="preserve"> </w:t>
-            </w:r>
-            <w:proofErr w:type="gramStart"/>
-            <w:r>
-              <w:t>provide</w:t>
-            </w:r>
-            <w:proofErr w:type="gramEnd"/>
-            <w:r>
-              <w:t xml:space="preserve"> an option to select the user role (Client/Supplier) </w:t>
-            </w:r>
-            <w:proofErr w:type="gramStart"/>
-            <w:r>
-              <w:t>in</w:t>
-            </w:r>
-            <w:proofErr w:type="gramEnd"/>
-            <w:r>
-              <w:t xml:space="preserve"> the registration page</w:t>
+            <w:r>
+              <w:t>The system SHALL provide an option to select the user role (Client/Supplier) in the registration page</w:t>
             </w:r>
           </w:p>
         </w:tc>
@@ -3191,15 +3209,10 @@
               <w:spacing w:before="0" w:after="0"/>
             </w:pPr>
             <w:r>
-              <w:t xml:space="preserve">The system SHALL </w:t>
-            </w:r>
-            <w:proofErr w:type="gramStart"/>
-            <w:r>
-              <w:t>not</w:t>
-            </w:r>
-            <w:proofErr w:type="gramEnd"/>
-            <w:r>
-              <w:t xml:space="preserve"> accept username length less than 3 or more than 50 characters</w:t>
+              <w:t>The system SHALL not accept username length l</w:t>
+            </w:r>
+            <w:r>
+              <w:t>ess than 3 or more than 50 characters</w:t>
             </w:r>
           </w:p>
         </w:tc>
@@ -3310,7 +3323,10 @@
       <w:bookmarkStart w:id="17" w:name="_ycedpsdujo1b" w:colFirst="0" w:colLast="0"/>
       <w:bookmarkEnd w:id="17"/>
       <w:r>
-        <w:t>3.2. User Login and Authentication</w:t>
+        <w:t xml:space="preserve">3.2. User Login </w:t>
+      </w:r>
+      <w:r>
+        <w:t>and Authentication</w:t>
       </w:r>
     </w:p>
     <w:tbl>
@@ -3438,15 +3454,7 @@
               <w:spacing w:before="0" w:after="0"/>
             </w:pPr>
             <w:r>
-              <w:t xml:space="preserve">The system SHALL </w:t>
-            </w:r>
-            <w:proofErr w:type="gramStart"/>
-            <w:r>
-              <w:t>provide</w:t>
-            </w:r>
-            <w:proofErr w:type="gramEnd"/>
-            <w:r>
-              <w:t xml:space="preserve"> a login page with a secure login functionality with (email and password) input fields for registered users.</w:t>
+              <w:t>The system SHALL provide a login page with a secure login functionality with (email and password) input fields for registered users.</w:t>
             </w:r>
           </w:p>
         </w:tc>
@@ -3665,6 +3673,7 @@
               <w:widowControl w:val="0"/>
               <w:spacing w:before="0" w:after="0"/>
             </w:pPr>
+            <w:bookmarkStart w:id="19" w:name="_GoBack" w:colFirst="0" w:colLast="0"/>
             <w:r>
               <w:t>SRS-FN-Admin-001</w:t>
             </w:r>
@@ -3694,21 +3703,65 @@
               <w:spacing w:before="0" w:after="0"/>
             </w:pPr>
             <w:r>
-              <w:t xml:space="preserve">The system SHALL </w:t>
-            </w:r>
-            <w:proofErr w:type="gramStart"/>
-            <w:r>
-              <w:t>allow</w:t>
-            </w:r>
-            <w:proofErr w:type="gramEnd"/>
-            <w:r>
-              <w:t xml:space="preserve"> the admin to add new products to the product list including product name, photo, description, price, stock </w:t>
+              <w:t xml:space="preserve">The system SHALL allow the admin to add new products to the product list including product name, photo, description, price, stock </w:t>
             </w:r>
             <w:proofErr w:type="spellStart"/>
             <w:r>
               <w:t>avaliability</w:t>
             </w:r>
+            <w:r>
+              <w:t>,supplier</w:t>
+            </w:r>
             <w:proofErr w:type="spellEnd"/>
+            <w:r>
+              <w:t xml:space="preserve"> id</w:t>
+            </w:r>
+          </w:p>
+        </w:tc>
+      </w:tr>
+      <w:bookmarkEnd w:id="19"/>
+      <w:tr>
+        <w:tc>
+          <w:tcPr>
+            <w:tcW w:w="2235" w:type="dxa"/>
+            <w:tcMar>
+              <w:top w:w="100" w:type="dxa"/>
+              <w:left w:w="100" w:type="dxa"/>
+              <w:bottom w:w="100" w:type="dxa"/>
+              <w:right w:w="100" w:type="dxa"/>
+            </w:tcMar>
+          </w:tcPr>
+          <w:p>
+            <w:pPr>
+              <w:widowControl w:val="0"/>
+              <w:spacing w:before="0" w:after="0"/>
+            </w:pPr>
+            <w:r>
+              <w:t>SRS-FN-Admin-002</w:t>
+            </w:r>
+          </w:p>
+        </w:tc>
+        <w:tc>
+          <w:tcPr>
+            <w:tcW w:w="7125" w:type="dxa"/>
+            <w:tcMar>
+              <w:top w:w="100" w:type="dxa"/>
+              <w:left w:w="100" w:type="dxa"/>
+              <w:bottom w:w="100" w:type="dxa"/>
+              <w:right w:w="100" w:type="dxa"/>
+            </w:tcMar>
+          </w:tcPr>
+          <w:p>
+            <w:pPr>
+              <w:widowControl w:val="0"/>
+            </w:pPr>
+            <w:r>
+              <w:t xml:space="preserve">The system SHALL allow the admin to remove products from the </w:t>
+            </w:r>
+            <w:r>
+              <w:lastRenderedPageBreak/>
+              <w:t>product list.</w:t>
+            </w:r>
           </w:p>
         </w:tc>
       </w:tr>
@@ -3729,7 +3782,8 @@
               <w:spacing w:before="0" w:after="0"/>
             </w:pPr>
             <w:r>
-              <w:t>SRS-FN-Admin-002</w:t>
+              <w:lastRenderedPageBreak/>
+              <w:t>SRS-FN-Admin-003</w:t>
             </w:r>
           </w:p>
         </w:tc>
@@ -3748,19 +3802,17 @@
               <w:widowControl w:val="0"/>
             </w:pPr>
             <w:r>
-              <w:t xml:space="preserve">The system SHALL </w:t>
-            </w:r>
+              <w:t xml:space="preserve">The system SHALL allow the admin to add, remove </w:t>
+            </w:r>
+            <w:proofErr w:type="spellStart"/>
             <w:proofErr w:type="gramStart"/>
             <w:r>
-              <w:t>allow</w:t>
-            </w:r>
+              <w:t>customers</w:t>
+            </w:r>
+            <w:proofErr w:type="spellEnd"/>
             <w:proofErr w:type="gramEnd"/>
             <w:r>
-              <w:t xml:space="preserve"> the admin to remove products from the </w:t>
-            </w:r>
-            <w:r>
-              <w:lastRenderedPageBreak/>
-              <w:t>product list.</w:t>
+              <w:t xml:space="preserve"> accounts.</w:t>
             </w:r>
           </w:p>
         </w:tc>
@@ -3782,8 +3834,7 @@
               <w:spacing w:before="0" w:after="0"/>
             </w:pPr>
             <w:r>
-              <w:lastRenderedPageBreak/>
-              <w:t>SRS-FN-Admin-003</w:t>
+              <w:t>SRS-FN-Admin-004</w:t>
             </w:r>
           </w:p>
         </w:tc>
@@ -3802,25 +3853,7 @@
               <w:widowControl w:val="0"/>
             </w:pPr>
             <w:r>
-              <w:t xml:space="preserve">The system SHALL </w:t>
-            </w:r>
-            <w:proofErr w:type="gramStart"/>
-            <w:r>
-              <w:t>allow</w:t>
-            </w:r>
-            <w:proofErr w:type="gramEnd"/>
-            <w:r>
-              <w:t xml:space="preserve"> the admin to add, remove </w:t>
-            </w:r>
-            <w:proofErr w:type="spellStart"/>
-            <w:proofErr w:type="gramStart"/>
-            <w:r>
-              <w:t>customers</w:t>
-            </w:r>
-            <w:proofErr w:type="spellEnd"/>
-            <w:proofErr w:type="gramEnd"/>
-            <w:r>
-              <w:t xml:space="preserve"> accounts.</w:t>
+              <w:t>The system SHALL allow the admin to add, remove suppliers accounts</w:t>
             </w:r>
           </w:p>
         </w:tc>
@@ -3842,7 +3875,7 @@
               <w:spacing w:before="0" w:after="0"/>
             </w:pPr>
             <w:r>
-              <w:t>SRS-FN-Admin-004</w:t>
+              <w:t>SRS-FN-Admin-005</w:t>
             </w:r>
           </w:p>
         </w:tc>
@@ -3861,15 +3894,18 @@
               <w:widowControl w:val="0"/>
             </w:pPr>
             <w:r>
-              <w:t xml:space="preserve">The system SHALL </w:t>
+              <w:t>The system SHALL allow</w:t>
+            </w:r>
+            <w:r>
+              <w:t xml:space="preserve"> the admin to view a list of all </w:t>
             </w:r>
             <w:proofErr w:type="gramStart"/>
             <w:r>
-              <w:t>allow</w:t>
+              <w:t>users(</w:t>
             </w:r>
             <w:proofErr w:type="gramEnd"/>
             <w:r>
-              <w:t xml:space="preserve"> the admin to add, remove suppliers accounts</w:t>
+              <w:t>suppliers, customers)  in the system.</w:t>
             </w:r>
           </w:p>
         </w:tc>
@@ -3891,7 +3927,7 @@
               <w:spacing w:before="0" w:after="0"/>
             </w:pPr>
             <w:r>
-              <w:t>SRS-FN-Admin-005</w:t>
+              <w:t>SRS-FN-Admin-006</w:t>
             </w:r>
           </w:p>
         </w:tc>
@@ -3910,31 +3946,7 @@
               <w:widowControl w:val="0"/>
             </w:pPr>
             <w:r>
-              <w:t xml:space="preserve">The system SHALL </w:t>
-            </w:r>
-            <w:proofErr w:type="gramStart"/>
-            <w:r>
-              <w:t>allow</w:t>
-            </w:r>
-            <w:proofErr w:type="gramEnd"/>
-            <w:r>
-              <w:t xml:space="preserve"> the admin to view a list of all </w:t>
-            </w:r>
-            <w:proofErr w:type="gramStart"/>
-            <w:r>
-              <w:t>users(</w:t>
-            </w:r>
-            <w:proofErr w:type="gramEnd"/>
-            <w:r>
-              <w:t xml:space="preserve">suppliers, </w:t>
-            </w:r>
-            <w:proofErr w:type="gramStart"/>
-            <w:r>
-              <w:t>customers)  in</w:t>
-            </w:r>
-            <w:proofErr w:type="gramEnd"/>
-            <w:r>
-              <w:t xml:space="preserve"> the system.</w:t>
+              <w:t>The system SHALL allow the admin to view a list of all orders in the system</w:t>
             </w:r>
           </w:p>
         </w:tc>
@@ -3956,7 +3968,7 @@
               <w:spacing w:before="0" w:after="0"/>
             </w:pPr>
             <w:r>
-              <w:t>SRS-FN-Admin-006</w:t>
+              <w:t>SRS-FN-Admin-007</w:t>
             </w:r>
           </w:p>
         </w:tc>
@@ -3975,64 +3987,10 @@
               <w:widowControl w:val="0"/>
             </w:pPr>
             <w:r>
-              <w:t xml:space="preserve">The system SHALL </w:t>
-            </w:r>
-            <w:proofErr w:type="gramStart"/>
-            <w:r>
-              <w:t>allow</w:t>
-            </w:r>
-            <w:proofErr w:type="gramEnd"/>
-            <w:r>
-              <w:t xml:space="preserve"> the admin to view a list of all orders in the system</w:t>
-            </w:r>
-          </w:p>
-        </w:tc>
-      </w:tr>
-      <w:tr>
-        <w:tc>
-          <w:tcPr>
-            <w:tcW w:w="2235" w:type="dxa"/>
-            <w:tcMar>
-              <w:top w:w="100" w:type="dxa"/>
-              <w:left w:w="100" w:type="dxa"/>
-              <w:bottom w:w="100" w:type="dxa"/>
-              <w:right w:w="100" w:type="dxa"/>
-            </w:tcMar>
-          </w:tcPr>
-          <w:p>
-            <w:pPr>
-              <w:widowControl w:val="0"/>
-              <w:spacing w:before="0" w:after="0"/>
-            </w:pPr>
-            <w:r>
-              <w:t>SRS-FN-Admin-007</w:t>
-            </w:r>
-          </w:p>
-        </w:tc>
-        <w:tc>
-          <w:tcPr>
-            <w:tcW w:w="7125" w:type="dxa"/>
-            <w:tcMar>
-              <w:top w:w="100" w:type="dxa"/>
-              <w:left w:w="100" w:type="dxa"/>
-              <w:bottom w:w="100" w:type="dxa"/>
-              <w:right w:w="100" w:type="dxa"/>
-            </w:tcMar>
-          </w:tcPr>
-          <w:p>
-            <w:pPr>
-              <w:widowControl w:val="0"/>
-            </w:pPr>
-            <w:r>
-              <w:t xml:space="preserve">The system SHALL </w:t>
-            </w:r>
-            <w:proofErr w:type="gramStart"/>
-            <w:r>
-              <w:t>allow</w:t>
-            </w:r>
-            <w:proofErr w:type="gramEnd"/>
-            <w:r>
-              <w:t xml:space="preserve"> the admin to approve or reject product submissions from suppliers.</w:t>
+              <w:t>The system SHALL allow the admin to approve or reject product submi</w:t>
+            </w:r>
+            <w:r>
+              <w:t>ssions from suppliers.</w:t>
             </w:r>
           </w:p>
         </w:tc>
@@ -4047,8 +4005,8 @@
           <w:szCs w:val="24"/>
         </w:rPr>
       </w:pPr>
-      <w:bookmarkStart w:id="19" w:name="_jszfqs8njk4y" w:colFirst="0" w:colLast="0"/>
-      <w:bookmarkEnd w:id="19"/>
+      <w:bookmarkStart w:id="20" w:name="_jszfqs8njk4y" w:colFirst="0" w:colLast="0"/>
+      <w:bookmarkEnd w:id="20"/>
       <w:r>
         <w:t>3.4. Supplier Functions</w:t>
       </w:r>
@@ -4167,15 +4125,7 @@
               <w:widowControl w:val="0"/>
             </w:pPr>
             <w:r>
-              <w:t xml:space="preserve">The system SHALL </w:t>
-            </w:r>
-            <w:proofErr w:type="gramStart"/>
-            <w:r>
-              <w:t>allow</w:t>
-            </w:r>
-            <w:proofErr w:type="gramEnd"/>
-            <w:r>
-              <w:t xml:space="preserve"> suppliers to submit new products to the product list with all information (photo, name, description, stock availability and price) </w:t>
+              <w:t xml:space="preserve">The system SHALL allow suppliers to submit new products to the product list with all information (photo, name, description, stock availability and price) </w:t>
             </w:r>
           </w:p>
         </w:tc>
@@ -4216,15 +4166,7 @@
               <w:widowControl w:val="0"/>
             </w:pPr>
             <w:r>
-              <w:t xml:space="preserve">The system SHALL </w:t>
-            </w:r>
-            <w:proofErr w:type="gramStart"/>
-            <w:r>
-              <w:t>allow</w:t>
-            </w:r>
-            <w:proofErr w:type="gramEnd"/>
-            <w:r>
-              <w:t xml:space="preserve"> suppliers to remove only their products from product list.</w:t>
+              <w:t>The system SHALL allow suppliers to remove only their products from product list.</w:t>
             </w:r>
           </w:p>
         </w:tc>
@@ -4269,7 +4211,10 @@
               <w:widowControl w:val="0"/>
             </w:pPr>
             <w:r>
-              <w:t>The system SHALL allow suppliers to view the information of the specific orders related to their products, including customer’s address, quantity ordered, and order status</w:t>
+              <w:t>The system SHALL allow suppliers to view the information of the specific orders related to their products, including customer’s addre</w:t>
+            </w:r>
+            <w:r>
+              <w:t>ss, quantity ordered, and order status</w:t>
             </w:r>
           </w:p>
         </w:tc>
@@ -4281,8 +4226,8 @@
         <w:pStyle w:val="Heading2"/>
         <w:spacing w:before="240" w:after="240"/>
       </w:pPr>
-      <w:bookmarkStart w:id="20" w:name="_1krx9yreemkt" w:colFirst="0" w:colLast="0"/>
-      <w:bookmarkEnd w:id="20"/>
+      <w:bookmarkStart w:id="21" w:name="_1krx9yreemkt" w:colFirst="0" w:colLast="0"/>
+      <w:bookmarkEnd w:id="21"/>
       <w:r>
         <w:t>3.5. Product List Dashboard</w:t>
       </w:r>
@@ -4452,23 +4397,7 @@
               <w:widowControl w:val="0"/>
             </w:pPr>
             <w:r>
-              <w:t xml:space="preserve">The </w:t>
-            </w:r>
-            <w:proofErr w:type="gramStart"/>
-            <w:r>
-              <w:t>system SHALL</w:t>
-            </w:r>
-            <w:proofErr w:type="gramEnd"/>
-            <w:r>
-              <w:t xml:space="preserve"> </w:t>
-            </w:r>
-            <w:proofErr w:type="gramStart"/>
-            <w:r>
-              <w:t>display</w:t>
-            </w:r>
-            <w:proofErr w:type="gramEnd"/>
-            <w:r>
-              <w:t xml:space="preserve"> the </w:t>
+              <w:t xml:space="preserve">The system SHALL display the </w:t>
             </w:r>
             <w:r>
               <w:rPr>
@@ -4519,31 +4448,7 @@
               <w:widowControl w:val="0"/>
             </w:pPr>
             <w:r>
-              <w:t xml:space="preserve">The </w:t>
-            </w:r>
-            <w:proofErr w:type="gramStart"/>
-            <w:r>
-              <w:t>system SHALL</w:t>
-            </w:r>
-            <w:proofErr w:type="gramEnd"/>
-            <w:r>
-              <w:t xml:space="preserve"> </w:t>
-            </w:r>
-            <w:proofErr w:type="gramStart"/>
-            <w:r>
-              <w:t>display</w:t>
-            </w:r>
-            <w:proofErr w:type="gramEnd"/>
-            <w:r>
-              <w:t xml:space="preserve"> </w:t>
-            </w:r>
-            <w:proofErr w:type="gramStart"/>
-            <w:r>
-              <w:t>the</w:t>
-            </w:r>
-            <w:proofErr w:type="gramEnd"/>
-            <w:r>
-              <w:t xml:space="preserve"> </w:t>
+              <w:t xml:space="preserve">The system SHALL display the </w:t>
             </w:r>
             <w:r>
               <w:rPr>
@@ -4644,21 +4549,11 @@
             <w:pPr>
               <w:widowControl w:val="0"/>
             </w:pPr>
-            <w:proofErr w:type="gramStart"/>
-            <w:r>
-              <w:t>The system SHALL</w:t>
-            </w:r>
-            <w:proofErr w:type="gramEnd"/>
-            <w:r>
-              <w:t xml:space="preserve"> </w:t>
-            </w:r>
-            <w:proofErr w:type="gramStart"/>
-            <w:r>
-              <w:t>display</w:t>
-            </w:r>
-            <w:proofErr w:type="gramEnd"/>
-            <w:r>
-              <w:t xml:space="preserve"> the </w:t>
+            <w:r>
+              <w:t xml:space="preserve">The system SHALL </w:t>
+            </w:r>
+            <w:r>
+              <w:t xml:space="preserve">display the </w:t>
             </w:r>
             <w:r>
               <w:rPr>
@@ -4709,15 +4604,7 @@
               <w:widowControl w:val="0"/>
             </w:pPr>
             <w:r>
-              <w:t xml:space="preserve">The system SHALL </w:t>
-            </w:r>
-            <w:proofErr w:type="gramStart"/>
-            <w:r>
-              <w:t>contain</w:t>
-            </w:r>
-            <w:proofErr w:type="gramEnd"/>
-            <w:r>
-              <w:t xml:space="preserve"> the </w:t>
+              <w:t xml:space="preserve">The system SHALL contain the </w:t>
             </w:r>
             <w:r>
               <w:rPr>
@@ -4768,7 +4655,10 @@
               <w:widowControl w:val="0"/>
             </w:pPr>
             <w:r>
-              <w:t>The system SHALL contain the button “Add to Cart” for each product</w:t>
+              <w:t>The system SHALL contain the button “Add to</w:t>
+            </w:r>
+            <w:r>
+              <w:t xml:space="preserve"> Cart” for each product</w:t>
             </w:r>
           </w:p>
         </w:tc>
@@ -4779,8 +4669,8 @@
       <w:pPr>
         <w:pStyle w:val="Heading2"/>
       </w:pPr>
-      <w:bookmarkStart w:id="21" w:name="_rg1iq7rrjf7h" w:colFirst="0" w:colLast="0"/>
-      <w:bookmarkEnd w:id="21"/>
+      <w:bookmarkStart w:id="22" w:name="_rg1iq7rrjf7h" w:colFirst="0" w:colLast="0"/>
+      <w:bookmarkEnd w:id="22"/>
       <w:r>
         <w:lastRenderedPageBreak/>
         <w:t>3.6. Shopping Cart Functionality</w:t>
@@ -4949,15 +4839,7 @@
               <w:widowControl w:val="0"/>
             </w:pPr>
             <w:r>
-              <w:t xml:space="preserve">The system SHALL </w:t>
-            </w:r>
-            <w:proofErr w:type="gramStart"/>
-            <w:r>
-              <w:t>allow</w:t>
-            </w:r>
-            <w:proofErr w:type="gramEnd"/>
-            <w:r>
-              <w:t xml:space="preserve"> customers to add products to the shopping cart with a specified quantity.</w:t>
+              <w:t>The system SHALL allow customers to add products to the shopping cart with a specified quantity.</w:t>
             </w:r>
           </w:p>
         </w:tc>
@@ -4998,15 +4880,7 @@
               <w:widowControl w:val="0"/>
             </w:pPr>
             <w:r>
-              <w:t xml:space="preserve">The system SHALL </w:t>
-            </w:r>
-            <w:proofErr w:type="gramStart"/>
-            <w:r>
-              <w:t>allow</w:t>
-            </w:r>
-            <w:proofErr w:type="gramEnd"/>
-            <w:r>
-              <w:t xml:space="preserve"> customers to remove items from the shopping cart.</w:t>
+              <w:t>The system SHALL allow customers to remove items from the shopping cart.</w:t>
             </w:r>
           </w:p>
         </w:tc>
@@ -5055,15 +4929,7 @@
             </w:r>
             <w:proofErr w:type="gramEnd"/>
             <w:r>
-              <w:t xml:space="preserve"> a “Proceed to </w:t>
-            </w:r>
-            <w:proofErr w:type="gramStart"/>
-            <w:r>
-              <w:t>Checkout”  button</w:t>
-            </w:r>
-            <w:proofErr w:type="gramEnd"/>
-            <w:r>
-              <w:t xml:space="preserve"> from the shopping cart page.</w:t>
+              <w:t xml:space="preserve"> a “Proceed to Checkout”  button from the shopping cart page.</w:t>
             </w:r>
           </w:p>
         </w:tc>
@@ -5074,8 +4940,8 @@
       <w:pPr>
         <w:pStyle w:val="Heading2"/>
       </w:pPr>
-      <w:bookmarkStart w:id="22" w:name="_uzloii5d306z" w:colFirst="0" w:colLast="0"/>
-      <w:bookmarkEnd w:id="22"/>
+      <w:bookmarkStart w:id="23" w:name="_uzloii5d306z" w:colFirst="0" w:colLast="0"/>
+      <w:bookmarkEnd w:id="23"/>
       <w:r>
         <w:t>3.6. Order Processing</w:t>
       </w:r>
@@ -5202,15 +5068,7 @@
               <w:spacing w:before="0" w:after="0" w:line="240" w:lineRule="auto"/>
             </w:pPr>
             <w:r>
-              <w:t xml:space="preserve">The system SHALL </w:t>
-            </w:r>
-            <w:proofErr w:type="gramStart"/>
-            <w:r>
-              <w:t>provide</w:t>
-            </w:r>
-            <w:proofErr w:type="gramEnd"/>
-            <w:r>
-              <w:t xml:space="preserve"> an order confirmation page to revise and confirm the order</w:t>
+              <w:t>The system SHALL provide an order confirmation page to revise and confirm the order</w:t>
             </w:r>
           </w:p>
         </w:tc>
@@ -5259,23 +5117,10 @@
               <w:spacing w:before="0" w:after="0" w:line="240" w:lineRule="auto"/>
             </w:pPr>
             <w:r>
-              <w:t xml:space="preserve">The system SHALL </w:t>
-            </w:r>
-            <w:proofErr w:type="gramStart"/>
-            <w:r>
-              <w:t>provide</w:t>
-            </w:r>
-            <w:proofErr w:type="gramEnd"/>
-            <w:r>
-              <w:t xml:space="preserve"> an input </w:t>
-            </w:r>
-            <w:proofErr w:type="gramStart"/>
-            <w:r>
-              <w:t>field to</w:t>
-            </w:r>
-            <w:proofErr w:type="gramEnd"/>
-            <w:r>
-              <w:t xml:space="preserve"> </w:t>
+              <w:t xml:space="preserve">The system SHALL provide an input </w:t>
+            </w:r>
+            <w:r>
+              <w:t xml:space="preserve">field to </w:t>
             </w:r>
             <w:proofErr w:type="spellStart"/>
             <w:r>
@@ -5350,8 +5195,8 @@
       <w:pPr>
         <w:pStyle w:val="Heading2"/>
       </w:pPr>
-      <w:bookmarkStart w:id="23" w:name="_jj7q342wruj6" w:colFirst="0" w:colLast="0"/>
-      <w:bookmarkEnd w:id="23"/>
+      <w:bookmarkStart w:id="24" w:name="_jj7q342wruj6" w:colFirst="0" w:colLast="0"/>
+      <w:bookmarkEnd w:id="24"/>
       <w:r>
         <w:lastRenderedPageBreak/>
         <w:t>3.7. Notifications</w:t>
@@ -5468,13 +5313,8 @@
               <w:widowControl w:val="0"/>
             </w:pPr>
             <w:r>
-              <w:t xml:space="preserve">The system SHALL </w:t>
-            </w:r>
-            <w:proofErr w:type="gramStart"/>
-            <w:r>
-              <w:t>send</w:t>
-            </w:r>
-            <w:proofErr w:type="gramEnd"/>
+              <w:t>The system SHALL send</w:t>
+            </w:r>
             <w:r>
               <w:t xml:space="preserve"> automated email notifications to customers after successful checkout including success message and order summary</w:t>
             </w:r>
@@ -5516,29 +5356,8 @@
             <w:pPr>
               <w:widowControl w:val="0"/>
             </w:pPr>
-            <w:proofErr w:type="gramStart"/>
-            <w:r>
-              <w:t>The system SHALL</w:t>
-            </w:r>
-            <w:proofErr w:type="gramEnd"/>
-            <w:r>
-              <w:t xml:space="preserve"> </w:t>
-            </w:r>
-            <w:proofErr w:type="gramStart"/>
-            <w:r>
-              <w:t>send</w:t>
-            </w:r>
-            <w:proofErr w:type="gramEnd"/>
-            <w:r>
-              <w:t xml:space="preserve"> automated email notifications to customers after delivery including </w:t>
-            </w:r>
-            <w:proofErr w:type="gramStart"/>
-            <w:r>
-              <w:t>success</w:t>
-            </w:r>
-            <w:proofErr w:type="gramEnd"/>
-            <w:r>
-              <w:t xml:space="preserve"> delivery</w:t>
+            <w:r>
+              <w:t>The system SHALL send automated email notifications to customers after delivery including success delivery</w:t>
             </w:r>
           </w:p>
         </w:tc>
@@ -5582,8 +5401,8 @@
               <w:widowControl w:val="0"/>
               <w:ind w:left="0" w:firstLine="0"/>
             </w:pPr>
-            <w:bookmarkStart w:id="24" w:name="_x4mkh8b5xuce" w:colFirst="0" w:colLast="0"/>
-            <w:bookmarkEnd w:id="24"/>
+            <w:bookmarkStart w:id="25" w:name="_x4mkh8b5xuce" w:colFirst="0" w:colLast="0"/>
+            <w:bookmarkEnd w:id="25"/>
             <w:r>
               <w:t>Appendix</w:t>
             </w:r>
@@ -5600,12 +5419,12 @@
           <w:szCs w:val="42"/>
         </w:rPr>
       </w:pPr>
-      <w:bookmarkStart w:id="25" w:name="_4jyktaoiwb83" w:colFirst="0" w:colLast="0"/>
-      <w:bookmarkEnd w:id="25"/>
+      <w:bookmarkStart w:id="26" w:name="_4jyktaoiwb83" w:colFirst="0" w:colLast="0"/>
+      <w:bookmarkEnd w:id="26"/>
     </w:p>
     <w:p/>
     <w:sectPr>
-      <w:headerReference w:type="default" r:id="rId8"/>
+      <w:headerReference w:type="default" r:id="rId9"/>
       <w:pgSz w:w="12240" w:h="15840"/>
       <w:pgMar w:top="1440" w:right="1440" w:bottom="1440" w:left="1440" w:header="720" w:footer="720" w:gutter="0"/>
       <w:pgNumType w:start="1"/>
@@ -5616,7 +5435,7 @@
 </file>
 
 <file path=word/endnotes.xml><?xml version="1.0" encoding="utf-8"?>
-<w:endnotes xmlns:wpc="http://schemas.microsoft.com/office/word/2010/wordprocessingCanvas" xmlns:cx="http://schemas.microsoft.com/office/drawing/2014/chartex" xmlns:cx1="http://schemas.microsoft.com/office/drawing/2015/9/8/chartex" xmlns:cx2="http://schemas.microsoft.com/office/drawing/2015/10/21/chartex" xmlns:cx3="http://schemas.microsoft.com/office/drawing/2016/5/9/chartex" xmlns:cx4="http://schemas.microsoft.com/office/drawing/2016/5/10/chartex" xmlns:cx5="http://schemas.microsoft.com/office/drawing/2016/5/11/chartex" xmlns:cx6="http://schemas.microsoft.com/office/drawing/2016/5/12/chartex" xmlns:cx7="http://schemas.microsoft.com/office/drawing/2016/5/13/chartex" xmlns:cx8="http://schemas.microsoft.com/office/drawing/2016/5/14/chartex" xmlns:mc="http://schemas.openxmlformats.org/markup-compatibility/2006" xmlns:aink="http://schemas.microsoft.com/office/drawing/2016/ink" xmlns:am3d="http://schemas.microsoft.com/office/drawing/2017/model3d" xmlns:o="urn:schemas-microsoft-com:office:office" xmlns:oel="http://schemas.microsoft.com/office/2019/extlst" xmlns:r="http://schemas.openxmlformats.org/officeDocument/2006/relationships" xmlns:m="http://schemas.openxmlformats.org/officeDocument/2006/math" xmlns:v="urn:schemas-microsoft-com:vml" xmlns:wp14="http://schemas.microsoft.com/office/word/2010/wordprocessingDrawing" xmlns:wp="http://schemas.openxmlformats.org/drawingml/2006/wordprocessingDrawing" xmlns:w10="urn:schemas-microsoft-com:office:word" xmlns:w="http://schemas.openxmlformats.org/wordprocessingml/2006/main" xmlns:w14="http://schemas.microsoft.com/office/word/2010/wordml" xmlns:w15="http://schemas.microsoft.com/office/word/2012/wordml" xmlns:w16cex="http://schemas.microsoft.com/office/word/2018/wordml/cex" xmlns:w16cid="http://schemas.microsoft.com/office/word/2016/wordml/cid" xmlns:w16="http://schemas.microsoft.com/office/word/2018/wordml" xmlns:w16du="http://schemas.microsoft.com/office/word/2023/wordml/word16du" xmlns:w16sdtdh="http://schemas.microsoft.com/office/word/2020/wordml/sdtdatahash" xmlns:w16sdtfl="http://schemas.microsoft.com/office/word/2024/wordml/sdtformatlock" xmlns:w16se="http://schemas.microsoft.com/office/word/2015/wordml/symex" xmlns:wpg="http://schemas.microsoft.com/office/word/2010/wordprocessingGroup" xmlns:wpi="http://schemas.microsoft.com/office/word/2010/wordprocessingInk" xmlns:wne="http://schemas.microsoft.com/office/word/2006/wordml" xmlns:wps="http://schemas.microsoft.com/office/word/2010/wordprocessingShape" mc:Ignorable="w14 w15 w16se w16cid w16 w16cex w16sdtdh w16sdtfl w16du wp14">
+<w:endnotes xmlns:wpc="http://schemas.microsoft.com/office/word/2010/wordprocessingCanvas" xmlns:mc="http://schemas.openxmlformats.org/markup-compatibility/2006" xmlns:o="urn:schemas-microsoft-com:office:office" xmlns:r="http://schemas.openxmlformats.org/officeDocument/2006/relationships" xmlns:m="http://schemas.openxmlformats.org/officeDocument/2006/math" xmlns:v="urn:schemas-microsoft-com:vml" xmlns:wp14="http://schemas.microsoft.com/office/word/2010/wordprocessingDrawing" xmlns:wp="http://schemas.openxmlformats.org/drawingml/2006/wordprocessingDrawing" xmlns:w10="urn:schemas-microsoft-com:office:word" xmlns:w="http://schemas.openxmlformats.org/wordprocessingml/2006/main" xmlns:w14="http://schemas.microsoft.com/office/word/2010/wordml" xmlns:wpg="http://schemas.microsoft.com/office/word/2010/wordprocessingGroup" xmlns:wpi="http://schemas.microsoft.com/office/word/2010/wordprocessingInk" xmlns:wne="http://schemas.microsoft.com/office/word/2006/wordml" xmlns:wps="http://schemas.microsoft.com/office/word/2010/wordprocessingShape" mc:Ignorable="w14 wp14">
   <w:endnote w:type="separator" w:id="-1">
     <w:p>
       <w:pPr>
@@ -5641,7 +5460,7 @@
 </file>
 
 <file path=word/footnotes.xml><?xml version="1.0" encoding="utf-8"?>
-<w:footnotes xmlns:wpc="http://schemas.microsoft.com/office/word/2010/wordprocessingCanvas" xmlns:cx="http://schemas.microsoft.com/office/drawing/2014/chartex" xmlns:cx1="http://schemas.microsoft.com/office/drawing/2015/9/8/chartex" xmlns:cx2="http://schemas.microsoft.com/office/drawing/2015/10/21/chartex" xmlns:cx3="http://schemas.microsoft.com/office/drawing/2016/5/9/chartex" xmlns:cx4="http://schemas.microsoft.com/office/drawing/2016/5/10/chartex" xmlns:cx5="http://schemas.microsoft.com/office/drawing/2016/5/11/chartex" xmlns:cx6="http://schemas.microsoft.com/office/drawing/2016/5/12/chartex" xmlns:cx7="http://schemas.microsoft.com/office/drawing/2016/5/13/chartex" xmlns:cx8="http://schemas.microsoft.com/office/drawing/2016/5/14/chartex" xmlns:mc="http://schemas.openxmlformats.org/markup-compatibility/2006" xmlns:aink="http://schemas.microsoft.com/office/drawing/2016/ink" xmlns:am3d="http://schemas.microsoft.com/office/drawing/2017/model3d" xmlns:o="urn:schemas-microsoft-com:office:office" xmlns:oel="http://schemas.microsoft.com/office/2019/extlst" xmlns:r="http://schemas.openxmlformats.org/officeDocument/2006/relationships" xmlns:m="http://schemas.openxmlformats.org/officeDocument/2006/math" xmlns:v="urn:schemas-microsoft-com:vml" xmlns:wp14="http://schemas.microsoft.com/office/word/2010/wordprocessingDrawing" xmlns:wp="http://schemas.openxmlformats.org/drawingml/2006/wordprocessingDrawing" xmlns:w10="urn:schemas-microsoft-com:office:word" xmlns:w="http://schemas.openxmlformats.org/wordprocessingml/2006/main" xmlns:w14="http://schemas.microsoft.com/office/word/2010/wordml" xmlns:w15="http://schemas.microsoft.com/office/word/2012/wordml" xmlns:w16cex="http://schemas.microsoft.com/office/word/2018/wordml/cex" xmlns:w16cid="http://schemas.microsoft.com/office/word/2016/wordml/cid" xmlns:w16="http://schemas.microsoft.com/office/word/2018/wordml" xmlns:w16du="http://schemas.microsoft.com/office/word/2023/wordml/word16du" xmlns:w16sdtdh="http://schemas.microsoft.com/office/word/2020/wordml/sdtdatahash" xmlns:w16sdtfl="http://schemas.microsoft.com/office/word/2024/wordml/sdtformatlock" xmlns:w16se="http://schemas.microsoft.com/office/word/2015/wordml/symex" xmlns:wpg="http://schemas.microsoft.com/office/word/2010/wordprocessingGroup" xmlns:wpi="http://schemas.microsoft.com/office/word/2010/wordprocessingInk" xmlns:wne="http://schemas.microsoft.com/office/word/2006/wordml" xmlns:wps="http://schemas.microsoft.com/office/word/2010/wordprocessingShape" mc:Ignorable="w14 w15 w16se w16cid w16 w16cex w16sdtdh w16sdtfl w16du wp14">
+<w:footnotes xmlns:wpc="http://schemas.microsoft.com/office/word/2010/wordprocessingCanvas" xmlns:mc="http://schemas.openxmlformats.org/markup-compatibility/2006" xmlns:o="urn:schemas-microsoft-com:office:office" xmlns:r="http://schemas.openxmlformats.org/officeDocument/2006/relationships" xmlns:m="http://schemas.openxmlformats.org/officeDocument/2006/math" xmlns:v="urn:schemas-microsoft-com:vml" xmlns:wp14="http://schemas.microsoft.com/office/word/2010/wordprocessingDrawing" xmlns:wp="http://schemas.openxmlformats.org/drawingml/2006/wordprocessingDrawing" xmlns:w10="urn:schemas-microsoft-com:office:word" xmlns:w="http://schemas.openxmlformats.org/wordprocessingml/2006/main" xmlns:w14="http://schemas.microsoft.com/office/word/2010/wordml" xmlns:wpg="http://schemas.microsoft.com/office/word/2010/wordprocessingGroup" xmlns:wpi="http://schemas.microsoft.com/office/word/2010/wordprocessingInk" xmlns:wne="http://schemas.microsoft.com/office/word/2006/wordml" xmlns:wps="http://schemas.microsoft.com/office/word/2010/wordprocessingShape" mc:Ignorable="w14 wp14">
   <w:footnote w:type="separator" w:id="-1">
     <w:p>
       <w:pPr>
@@ -5666,14 +5485,14 @@
 </file>
 
 <file path=word/header1.xml><?xml version="1.0" encoding="utf-8"?>
-<w:hdr xmlns:wpc="http://schemas.microsoft.com/office/word/2010/wordprocessingCanvas" xmlns:cx="http://schemas.microsoft.com/office/drawing/2014/chartex" xmlns:cx1="http://schemas.microsoft.com/office/drawing/2015/9/8/chartex" xmlns:cx2="http://schemas.microsoft.com/office/drawing/2015/10/21/chartex" xmlns:cx3="http://schemas.microsoft.com/office/drawing/2016/5/9/chartex" xmlns:cx4="http://schemas.microsoft.com/office/drawing/2016/5/10/chartex" xmlns:cx5="http://schemas.microsoft.com/office/drawing/2016/5/11/chartex" xmlns:cx6="http://schemas.microsoft.com/office/drawing/2016/5/12/chartex" xmlns:cx7="http://schemas.microsoft.com/office/drawing/2016/5/13/chartex" xmlns:cx8="http://schemas.microsoft.com/office/drawing/2016/5/14/chartex" xmlns:mc="http://schemas.openxmlformats.org/markup-compatibility/2006" xmlns:aink="http://schemas.microsoft.com/office/drawing/2016/ink" xmlns:am3d="http://schemas.microsoft.com/office/drawing/2017/model3d" xmlns:o="urn:schemas-microsoft-com:office:office" xmlns:oel="http://schemas.microsoft.com/office/2019/extlst" xmlns:r="http://schemas.openxmlformats.org/officeDocument/2006/relationships" xmlns:m="http://schemas.openxmlformats.org/officeDocument/2006/math" xmlns:v="urn:schemas-microsoft-com:vml" xmlns:wp14="http://schemas.microsoft.com/office/word/2010/wordprocessingDrawing" xmlns:wp="http://schemas.openxmlformats.org/drawingml/2006/wordprocessingDrawing" xmlns:w10="urn:schemas-microsoft-com:office:word" xmlns:w="http://schemas.openxmlformats.org/wordprocessingml/2006/main" xmlns:w14="http://schemas.microsoft.com/office/word/2010/wordml" xmlns:w15="http://schemas.microsoft.com/office/word/2012/wordml" xmlns:w16cex="http://schemas.microsoft.com/office/word/2018/wordml/cex" xmlns:w16cid="http://schemas.microsoft.com/office/word/2016/wordml/cid" xmlns:w16="http://schemas.microsoft.com/office/word/2018/wordml" xmlns:w16du="http://schemas.microsoft.com/office/word/2023/wordml/word16du" xmlns:w16sdtdh="http://schemas.microsoft.com/office/word/2020/wordml/sdtdatahash" xmlns:w16sdtfl="http://schemas.microsoft.com/office/word/2024/wordml/sdtformatlock" xmlns:w16se="http://schemas.microsoft.com/office/word/2015/wordml/symex" xmlns:wpg="http://schemas.microsoft.com/office/word/2010/wordprocessingGroup" xmlns:wpi="http://schemas.microsoft.com/office/word/2010/wordprocessingInk" xmlns:wne="http://schemas.microsoft.com/office/word/2006/wordml" xmlns:wps="http://schemas.microsoft.com/office/word/2010/wordprocessingShape" mc:Ignorable="w14 w15 w16se w16cid w16 w16cex w16sdtdh w16sdtfl w16du wp14">
+<w:hdr xmlns:wpc="http://schemas.microsoft.com/office/word/2010/wordprocessingCanvas" xmlns:mc="http://schemas.openxmlformats.org/markup-compatibility/2006" xmlns:o="urn:schemas-microsoft-com:office:office" xmlns:r="http://schemas.openxmlformats.org/officeDocument/2006/relationships" xmlns:m="http://schemas.openxmlformats.org/officeDocument/2006/math" xmlns:v="urn:schemas-microsoft-com:vml" xmlns:wp14="http://schemas.microsoft.com/office/word/2010/wordprocessingDrawing" xmlns:wp="http://schemas.openxmlformats.org/drawingml/2006/wordprocessingDrawing" xmlns:w10="urn:schemas-microsoft-com:office:word" xmlns:w="http://schemas.openxmlformats.org/wordprocessingml/2006/main" xmlns:w14="http://schemas.microsoft.com/office/word/2010/wordml" xmlns:wpg="http://schemas.microsoft.com/office/word/2010/wordprocessingGroup" xmlns:wpi="http://schemas.microsoft.com/office/word/2010/wordprocessingInk" xmlns:wne="http://schemas.microsoft.com/office/word/2006/wordml" xmlns:wps="http://schemas.microsoft.com/office/word/2010/wordprocessingShape" mc:Ignorable="w14 wp14">
   <w:p/>
 </w:hdr>
 </file>
 
 <file path=word/numbering.xml><?xml version="1.0" encoding="utf-8"?>
-<w:numbering xmlns:wpc="http://schemas.microsoft.com/office/word/2010/wordprocessingCanvas" xmlns:cx="http://schemas.microsoft.com/office/drawing/2014/chartex" xmlns:cx1="http://schemas.microsoft.com/office/drawing/2015/9/8/chartex" xmlns:cx2="http://schemas.microsoft.com/office/drawing/2015/10/21/chartex" xmlns:cx3="http://schemas.microsoft.com/office/drawing/2016/5/9/chartex" xmlns:cx4="http://schemas.microsoft.com/office/drawing/2016/5/10/chartex" xmlns:cx5="http://schemas.microsoft.com/office/drawing/2016/5/11/chartex" xmlns:cx6="http://schemas.microsoft.com/office/drawing/2016/5/12/chartex" xmlns:cx7="http://schemas.microsoft.com/office/drawing/2016/5/13/chartex" xmlns:cx8="http://schemas.microsoft.com/office/drawing/2016/5/14/chartex" xmlns:mc="http://schemas.openxmlformats.org/markup-compatibility/2006" xmlns:aink="http://schemas.microsoft.com/office/drawing/2016/ink" xmlns:am3d="http://schemas.microsoft.com/office/drawing/2017/model3d" xmlns:o="urn:schemas-microsoft-com:office:office" xmlns:oel="http://schemas.microsoft.com/office/2019/extlst" xmlns:r="http://schemas.openxmlformats.org/officeDocument/2006/relationships" xmlns:m="http://schemas.openxmlformats.org/officeDocument/2006/math" xmlns:v="urn:schemas-microsoft-com:vml" xmlns:wp14="http://schemas.microsoft.com/office/word/2010/wordprocessingDrawing" xmlns:wp="http://schemas.openxmlformats.org/drawingml/2006/wordprocessingDrawing" xmlns:w10="urn:schemas-microsoft-com:office:word" xmlns:w="http://schemas.openxmlformats.org/wordprocessingml/2006/main" xmlns:w14="http://schemas.microsoft.com/office/word/2010/wordml" xmlns:w15="http://schemas.microsoft.com/office/word/2012/wordml" xmlns:w16cex="http://schemas.microsoft.com/office/word/2018/wordml/cex" xmlns:w16cid="http://schemas.microsoft.com/office/word/2016/wordml/cid" xmlns:w16="http://schemas.microsoft.com/office/word/2018/wordml" xmlns:w16du="http://schemas.microsoft.com/office/word/2023/wordml/word16du" xmlns:w16sdtdh="http://schemas.microsoft.com/office/word/2020/wordml/sdtdatahash" xmlns:w16sdtfl="http://schemas.microsoft.com/office/word/2024/wordml/sdtformatlock" xmlns:w16se="http://schemas.microsoft.com/office/word/2015/wordml/symex" xmlns:wpg="http://schemas.microsoft.com/office/word/2010/wordprocessingGroup" xmlns:wpi="http://schemas.microsoft.com/office/word/2010/wordprocessingInk" xmlns:wne="http://schemas.microsoft.com/office/word/2006/wordml" xmlns:wps="http://schemas.microsoft.com/office/word/2010/wordprocessingShape" mc:Ignorable="w14 w15 w16se w16cid w16 w16cex w16sdtdh w16sdtfl w16du wp14">
-  <w:abstractNum w:abstractNumId="0" w15:restartNumberingAfterBreak="0">
+<w:numbering xmlns:wpc="http://schemas.microsoft.com/office/word/2010/wordprocessingCanvas" xmlns:mc="http://schemas.openxmlformats.org/markup-compatibility/2006" xmlns:o="urn:schemas-microsoft-com:office:office" xmlns:r="http://schemas.openxmlformats.org/officeDocument/2006/relationships" xmlns:m="http://schemas.openxmlformats.org/officeDocument/2006/math" xmlns:v="urn:schemas-microsoft-com:vml" xmlns:wp14="http://schemas.microsoft.com/office/word/2010/wordprocessingDrawing" xmlns:wp="http://schemas.openxmlformats.org/drawingml/2006/wordprocessingDrawing" xmlns:w10="urn:schemas-microsoft-com:office:word" xmlns:w="http://schemas.openxmlformats.org/wordprocessingml/2006/main" xmlns:w14="http://schemas.microsoft.com/office/word/2010/wordml" xmlns:wpg="http://schemas.microsoft.com/office/word/2010/wordprocessingGroup" xmlns:wpi="http://schemas.microsoft.com/office/word/2010/wordprocessingInk" xmlns:wne="http://schemas.microsoft.com/office/word/2006/wordml" xmlns:wps="http://schemas.microsoft.com/office/word/2010/wordprocessingShape" mc:Ignorable="w14 wp14">
+  <w:abstractNum w:abstractNumId="0">
     <w:nsid w:val="0EE11361"/>
     <w:multiLevelType w:val="multilevel"/>
     <w:tmpl w:val="313C1306"/>
@@ -5786,7 +5605,7 @@
       </w:rPr>
     </w:lvl>
   </w:abstractNum>
-  <w:abstractNum w:abstractNumId="1" w15:restartNumberingAfterBreak="0">
+  <w:abstractNum w:abstractNumId="1">
     <w:nsid w:val="106B7A3F"/>
     <w:multiLevelType w:val="multilevel"/>
     <w:tmpl w:val="34FE80D0"/>
@@ -5899,7 +5718,7 @@
       </w:rPr>
     </w:lvl>
   </w:abstractNum>
-  <w:abstractNum w:abstractNumId="2" w15:restartNumberingAfterBreak="0">
+  <w:abstractNum w:abstractNumId="2">
     <w:nsid w:val="2CBA0F66"/>
     <w:multiLevelType w:val="multilevel"/>
     <w:tmpl w:val="C44417BA"/>
@@ -6012,7 +5831,7 @@
       </w:rPr>
     </w:lvl>
   </w:abstractNum>
-  <w:abstractNum w:abstractNumId="3" w15:restartNumberingAfterBreak="0">
+  <w:abstractNum w:abstractNumId="3">
     <w:nsid w:val="2DC40623"/>
     <w:multiLevelType w:val="multilevel"/>
     <w:tmpl w:val="1D7C82DC"/>
@@ -6125,7 +5944,7 @@
       </w:rPr>
     </w:lvl>
   </w:abstractNum>
-  <w:abstractNum w:abstractNumId="4" w15:restartNumberingAfterBreak="0">
+  <w:abstractNum w:abstractNumId="4">
     <w:nsid w:val="2EED6E2C"/>
     <w:multiLevelType w:val="multilevel"/>
     <w:tmpl w:val="84A061E2"/>
@@ -6238,7 +6057,7 @@
       </w:rPr>
     </w:lvl>
   </w:abstractNum>
-  <w:abstractNum w:abstractNumId="5" w15:restartNumberingAfterBreak="0">
+  <w:abstractNum w:abstractNumId="5">
     <w:nsid w:val="4A7B0DC7"/>
     <w:multiLevelType w:val="multilevel"/>
     <w:tmpl w:val="831C3614"/>
@@ -6351,7 +6170,7 @@
       </w:rPr>
     </w:lvl>
   </w:abstractNum>
-  <w:abstractNum w:abstractNumId="6" w15:restartNumberingAfterBreak="0">
+  <w:abstractNum w:abstractNumId="6">
     <w:nsid w:val="55BA02C1"/>
     <w:multiLevelType w:val="multilevel"/>
     <w:tmpl w:val="863C4216"/>
@@ -6464,7 +6283,7 @@
       </w:rPr>
     </w:lvl>
   </w:abstractNum>
-  <w:abstractNum w:abstractNumId="7" w15:restartNumberingAfterBreak="0">
+  <w:abstractNum w:abstractNumId="7">
     <w:nsid w:val="67964062"/>
     <w:multiLevelType w:val="multilevel"/>
     <w:tmpl w:val="5E380F8C"/>
@@ -6577,7 +6396,7 @@
       </w:rPr>
     </w:lvl>
   </w:abstractNum>
-  <w:abstractNum w:abstractNumId="8" w15:restartNumberingAfterBreak="0">
+  <w:abstractNum w:abstractNumId="8">
     <w:nsid w:val="6F9D3791"/>
     <w:multiLevelType w:val="multilevel"/>
     <w:tmpl w:val="D3608EAA"/>
@@ -6690,45 +6509,45 @@
       </w:rPr>
     </w:lvl>
   </w:abstractNum>
-  <w:num w:numId="1" w16cid:durableId="211697239">
+  <w:num w:numId="1">
     <w:abstractNumId w:val="4"/>
   </w:num>
-  <w:num w:numId="2" w16cid:durableId="2133670641">
+  <w:num w:numId="2">
     <w:abstractNumId w:val="2"/>
   </w:num>
-  <w:num w:numId="3" w16cid:durableId="1289314907">
+  <w:num w:numId="3">
     <w:abstractNumId w:val="0"/>
   </w:num>
-  <w:num w:numId="4" w16cid:durableId="1300308013">
+  <w:num w:numId="4">
     <w:abstractNumId w:val="7"/>
   </w:num>
-  <w:num w:numId="5" w16cid:durableId="1441610408">
+  <w:num w:numId="5">
     <w:abstractNumId w:val="1"/>
   </w:num>
-  <w:num w:numId="6" w16cid:durableId="106971014">
+  <w:num w:numId="6">
     <w:abstractNumId w:val="6"/>
   </w:num>
-  <w:num w:numId="7" w16cid:durableId="777413942">
+  <w:num w:numId="7">
     <w:abstractNumId w:val="3"/>
   </w:num>
-  <w:num w:numId="8" w16cid:durableId="1443381570">
+  <w:num w:numId="8">
     <w:abstractNumId w:val="5"/>
   </w:num>
-  <w:num w:numId="9" w16cid:durableId="1075588210">
+  <w:num w:numId="9">
     <w:abstractNumId w:val="8"/>
   </w:num>
 </w:numbering>
 </file>
 
 <file path=word/styles.xml><?xml version="1.0" encoding="utf-8"?>
-<w:styles xmlns:mc="http://schemas.openxmlformats.org/markup-compatibility/2006" xmlns:r="http://schemas.openxmlformats.org/officeDocument/2006/relationships" xmlns:w="http://schemas.openxmlformats.org/wordprocessingml/2006/main" xmlns:w14="http://schemas.microsoft.com/office/word/2010/wordml" xmlns:w15="http://schemas.microsoft.com/office/word/2012/wordml" xmlns:w16cex="http://schemas.microsoft.com/office/word/2018/wordml/cex" xmlns:w16cid="http://schemas.microsoft.com/office/word/2016/wordml/cid" xmlns:w16="http://schemas.microsoft.com/office/word/2018/wordml" xmlns:w16du="http://schemas.microsoft.com/office/word/2023/wordml/word16du" xmlns:w16sdtdh="http://schemas.microsoft.com/office/word/2020/wordml/sdtdatahash" xmlns:w16sdtfl="http://schemas.microsoft.com/office/word/2024/wordml/sdtformatlock" xmlns:w16se="http://schemas.microsoft.com/office/word/2015/wordml/symex" mc:Ignorable="w14 w15 w16se w16cid w16 w16cex w16sdtdh w16sdtfl w16du">
+<w:styles xmlns:mc="http://schemas.openxmlformats.org/markup-compatibility/2006" xmlns:r="http://schemas.openxmlformats.org/officeDocument/2006/relationships" xmlns:w="http://schemas.openxmlformats.org/wordprocessingml/2006/main" xmlns:w14="http://schemas.microsoft.com/office/word/2010/wordml" mc:Ignorable="w14">
   <w:docDefaults>
     <w:rPrDefault>
       <w:rPr>
         <w:rFonts w:ascii="Times New Roman" w:eastAsia="Times New Roman" w:hAnsi="Times New Roman" w:cs="Times New Roman"/>
         <w:sz w:val="24"/>
         <w:szCs w:val="24"/>
-        <w:lang w:val="en" w:eastAsia="en-US" w:bidi="ar-SA"/>
+        <w:lang w:eastAsia="en-US" w:bidi="ar-SA"/>
       </w:rPr>
     </w:rPrDefault>
     <w:pPrDefault>
@@ -6737,383 +6556,144 @@
       </w:pPr>
     </w:pPrDefault>
   </w:docDefaults>
-  <w:latentStyles w:defLockedState="0" w:defUIPriority="99" w:defSemiHidden="0" w:defUnhideWhenUsed="0" w:defQFormat="0" w:count="376">
-    <w:lsdException w:name="Normal" w:uiPriority="0" w:qFormat="1"/>
-    <w:lsdException w:name="heading 1" w:uiPriority="9" w:qFormat="1"/>
-    <w:lsdException w:name="heading 2" w:semiHidden="1" w:uiPriority="9" w:unhideWhenUsed="1" w:qFormat="1"/>
-    <w:lsdException w:name="heading 3" w:semiHidden="1" w:uiPriority="9" w:unhideWhenUsed="1" w:qFormat="1"/>
-    <w:lsdException w:name="heading 4" w:semiHidden="1" w:uiPriority="9" w:unhideWhenUsed="1" w:qFormat="1"/>
-    <w:lsdException w:name="heading 5" w:semiHidden="1" w:uiPriority="9" w:unhideWhenUsed="1" w:qFormat="1"/>
-    <w:lsdException w:name="heading 6" w:semiHidden="1" w:uiPriority="9" w:unhideWhenUsed="1" w:qFormat="1"/>
-    <w:lsdException w:name="heading 7" w:semiHidden="1" w:uiPriority="9" w:unhideWhenUsed="1" w:qFormat="1"/>
-    <w:lsdException w:name="heading 8" w:semiHidden="1" w:uiPriority="9" w:unhideWhenUsed="1" w:qFormat="1"/>
-    <w:lsdException w:name="heading 9" w:semiHidden="1" w:uiPriority="9" w:unhideWhenUsed="1" w:qFormat="1"/>
-    <w:lsdException w:name="index 1" w:semiHidden="1" w:unhideWhenUsed="1"/>
-    <w:lsdException w:name="index 2" w:semiHidden="1" w:unhideWhenUsed="1"/>
-    <w:lsdException w:name="index 3" w:semiHidden="1" w:unhideWhenUsed="1"/>
-    <w:lsdException w:name="index 4" w:semiHidden="1" w:unhideWhenUsed="1"/>
-    <w:lsdException w:name="index 5" w:semiHidden="1" w:unhideWhenUsed="1"/>
-    <w:lsdException w:name="index 6" w:semiHidden="1" w:unhideWhenUsed="1"/>
-    <w:lsdException w:name="index 7" w:semiHidden="1" w:unhideWhenUsed="1"/>
-    <w:lsdException w:name="index 8" w:semiHidden="1" w:unhideWhenUsed="1"/>
-    <w:lsdException w:name="index 9" w:semiHidden="1" w:unhideWhenUsed="1"/>
-    <w:lsdException w:name="toc 1" w:semiHidden="1" w:uiPriority="39" w:unhideWhenUsed="1"/>
-    <w:lsdException w:name="toc 2" w:semiHidden="1" w:uiPriority="39" w:unhideWhenUsed="1"/>
-    <w:lsdException w:name="toc 3" w:semiHidden="1" w:uiPriority="39" w:unhideWhenUsed="1"/>
-    <w:lsdException w:name="toc 4" w:semiHidden="1" w:uiPriority="39" w:unhideWhenUsed="1"/>
-    <w:lsdException w:name="toc 5" w:semiHidden="1" w:uiPriority="39" w:unhideWhenUsed="1"/>
-    <w:lsdException w:name="toc 6" w:semiHidden="1" w:uiPriority="39" w:unhideWhenUsed="1"/>
-    <w:lsdException w:name="toc 7" w:semiHidden="1" w:uiPriority="39" w:unhideWhenUsed="1"/>
-    <w:lsdException w:name="toc 8" w:semiHidden="1" w:uiPriority="39" w:unhideWhenUsed="1"/>
-    <w:lsdException w:name="toc 9" w:semiHidden="1" w:uiPriority="39" w:unhideWhenUsed="1"/>
-    <w:lsdException w:name="Normal Indent" w:semiHidden="1" w:unhideWhenUsed="1"/>
-    <w:lsdException w:name="footnote text" w:semiHidden="1" w:unhideWhenUsed="1"/>
-    <w:lsdException w:name="annotation text" w:semiHidden="1" w:unhideWhenUsed="1"/>
-    <w:lsdException w:name="header" w:semiHidden="1" w:unhideWhenUsed="1"/>
-    <w:lsdException w:name="footer" w:semiHidden="1" w:unhideWhenUsed="1"/>
-    <w:lsdException w:name="index heading" w:semiHidden="1" w:unhideWhenUsed="1"/>
-    <w:lsdException w:name="caption" w:semiHidden="1" w:uiPriority="35" w:unhideWhenUsed="1" w:qFormat="1"/>
-    <w:lsdException w:name="table of figures" w:semiHidden="1" w:unhideWhenUsed="1"/>
-    <w:lsdException w:name="envelope address" w:semiHidden="1" w:unhideWhenUsed="1"/>
-    <w:lsdException w:name="envelope return" w:semiHidden="1" w:unhideWhenUsed="1"/>
-    <w:lsdException w:name="footnote reference" w:semiHidden="1" w:unhideWhenUsed="1"/>
-    <w:lsdException w:name="annotation reference" w:semiHidden="1" w:unhideWhenUsed="1"/>
-    <w:lsdException w:name="line number" w:semiHidden="1" w:unhideWhenUsed="1"/>
-    <w:lsdException w:name="page number" w:semiHidden="1" w:unhideWhenUsed="1"/>
-    <w:lsdException w:name="endnote reference" w:semiHidden="1" w:unhideWhenUsed="1"/>
-    <w:lsdException w:name="endnote text" w:semiHidden="1" w:unhideWhenUsed="1"/>
-    <w:lsdException w:name="table of authorities" w:semiHidden="1" w:unhideWhenUsed="1"/>
-    <w:lsdException w:name="macro" w:semiHidden="1" w:unhideWhenUsed="1"/>
-    <w:lsdException w:name="toa heading" w:semiHidden="1" w:unhideWhenUsed="1"/>
-    <w:lsdException w:name="List" w:semiHidden="1" w:unhideWhenUsed="1"/>
-    <w:lsdException w:name="List Bullet" w:semiHidden="1" w:unhideWhenUsed="1"/>
-    <w:lsdException w:name="List Number" w:semiHidden="1" w:unhideWhenUsed="1"/>
-    <w:lsdException w:name="List 2" w:semiHidden="1" w:unhideWhenUsed="1"/>
-    <w:lsdException w:name="List 3" w:semiHidden="1" w:unhideWhenUsed="1"/>
-    <w:lsdException w:name="List 4" w:semiHidden="1" w:unhideWhenUsed="1"/>
-    <w:lsdException w:name="List 5" w:semiHidden="1" w:unhideWhenUsed="1"/>
-    <w:lsdException w:name="List Bullet 2" w:semiHidden="1" w:unhideWhenUsed="1"/>
-    <w:lsdException w:name="List Bullet 3" w:semiHidden="1" w:unhideWhenUsed="1"/>
-    <w:lsdException w:name="List Bullet 4" w:semiHidden="1" w:unhideWhenUsed="1"/>
-    <w:lsdException w:name="List Bullet 5" w:semiHidden="1" w:unhideWhenUsed="1"/>
-    <w:lsdException w:name="List Number 2" w:semiHidden="1" w:unhideWhenUsed="1"/>
-    <w:lsdException w:name="List Number 3" w:semiHidden="1" w:unhideWhenUsed="1"/>
-    <w:lsdException w:name="List Number 4" w:semiHidden="1" w:unhideWhenUsed="1"/>
-    <w:lsdException w:name="List Number 5" w:semiHidden="1" w:unhideWhenUsed="1"/>
-    <w:lsdException w:name="Title" w:uiPriority="10" w:qFormat="1"/>
-    <w:lsdException w:name="Closing" w:semiHidden="1" w:unhideWhenUsed="1"/>
-    <w:lsdException w:name="Signature" w:semiHidden="1" w:unhideWhenUsed="1"/>
-    <w:lsdException w:name="Default Paragraph Font" w:semiHidden="1" w:uiPriority="1" w:unhideWhenUsed="1"/>
-    <w:lsdException w:name="Body Text" w:semiHidden="1" w:unhideWhenUsed="1"/>
-    <w:lsdException w:name="Body Text Indent" w:semiHidden="1" w:unhideWhenUsed="1"/>
-    <w:lsdException w:name="List Continue" w:semiHidden="1" w:unhideWhenUsed="1"/>
-    <w:lsdException w:name="List Continue 2" w:semiHidden="1" w:unhideWhenUsed="1"/>
-    <w:lsdException w:name="List Continue 3" w:semiHidden="1" w:unhideWhenUsed="1"/>
-    <w:lsdException w:name="List Continue 4" w:semiHidden="1" w:unhideWhenUsed="1"/>
-    <w:lsdException w:name="List Continue 5" w:semiHidden="1" w:unhideWhenUsed="1"/>
-    <w:lsdException w:name="Message Header" w:semiHidden="1" w:unhideWhenUsed="1"/>
-    <w:lsdException w:name="Subtitle" w:uiPriority="11" w:qFormat="1"/>
-    <w:lsdException w:name="Salutation" w:semiHidden="1" w:unhideWhenUsed="1"/>
-    <w:lsdException w:name="Date" w:semiHidden="1" w:unhideWhenUsed="1"/>
-    <w:lsdException w:name="Body Text First Indent" w:semiHidden="1" w:unhideWhenUsed="1"/>
-    <w:lsdException w:name="Body Text First Indent 2" w:semiHidden="1" w:unhideWhenUsed="1"/>
-    <w:lsdException w:name="Note Heading" w:semiHidden="1" w:unhideWhenUsed="1"/>
-    <w:lsdException w:name="Body Text 2" w:semiHidden="1" w:unhideWhenUsed="1"/>
-    <w:lsdException w:name="Body Text 3" w:semiHidden="1" w:unhideWhenUsed="1"/>
-    <w:lsdException w:name="Body Text Indent 2" w:semiHidden="1" w:unhideWhenUsed="1"/>
-    <w:lsdException w:name="Body Text Indent 3" w:semiHidden="1" w:unhideWhenUsed="1"/>
-    <w:lsdException w:name="Block Text" w:semiHidden="1" w:unhideWhenUsed="1"/>
-    <w:lsdException w:name="Hyperlink" w:semiHidden="1" w:unhideWhenUsed="1"/>
-    <w:lsdException w:name="FollowedHyperlink" w:semiHidden="1" w:unhideWhenUsed="1"/>
-    <w:lsdException w:name="Strong" w:uiPriority="22" w:qFormat="1"/>
-    <w:lsdException w:name="Emphasis" w:uiPriority="20" w:qFormat="1"/>
-    <w:lsdException w:name="Document Map" w:semiHidden="1" w:unhideWhenUsed="1"/>
-    <w:lsdException w:name="Plain Text" w:semiHidden="1" w:unhideWhenUsed="1"/>
-    <w:lsdException w:name="E-mail Signature" w:semiHidden="1" w:unhideWhenUsed="1"/>
-    <w:lsdException w:name="HTML Top of Form" w:semiHidden="1" w:unhideWhenUsed="1"/>
-    <w:lsdException w:name="HTML Bottom of Form" w:semiHidden="1" w:unhideWhenUsed="1"/>
-    <w:lsdException w:name="Normal (Web)" w:semiHidden="1" w:unhideWhenUsed="1"/>
-    <w:lsdException w:name="HTML Acronym" w:semiHidden="1" w:unhideWhenUsed="1"/>
-    <w:lsdException w:name="HTML Address" w:semiHidden="1" w:unhideWhenUsed="1"/>
-    <w:lsdException w:name="HTML Cite" w:semiHidden="1" w:unhideWhenUsed="1"/>
-    <w:lsdException w:name="HTML Code" w:semiHidden="1" w:unhideWhenUsed="1"/>
-    <w:lsdException w:name="HTML Definition" w:semiHidden="1" w:unhideWhenUsed="1"/>
-    <w:lsdException w:name="HTML Keyboard" w:semiHidden="1" w:unhideWhenUsed="1"/>
-    <w:lsdException w:name="HTML Preformatted" w:semiHidden="1" w:unhideWhenUsed="1"/>
-    <w:lsdException w:name="HTML Sample" w:semiHidden="1" w:unhideWhenUsed="1"/>
-    <w:lsdException w:name="HTML Typewriter" w:semiHidden="1" w:unhideWhenUsed="1"/>
-    <w:lsdException w:name="HTML Variable" w:semiHidden="1" w:unhideWhenUsed="1"/>
-    <w:lsdException w:name="Normal Table" w:semiHidden="1" w:unhideWhenUsed="1"/>
-    <w:lsdException w:name="annotation subject" w:semiHidden="1" w:unhideWhenUsed="1"/>
-    <w:lsdException w:name="No List" w:semiHidden="1" w:unhideWhenUsed="1"/>
-    <w:lsdException w:name="Outline List 1" w:semiHidden="1" w:unhideWhenUsed="1"/>
-    <w:lsdException w:name="Outline List 2" w:semiHidden="1" w:unhideWhenUsed="1"/>
-    <w:lsdException w:name="Outline List 3" w:semiHidden="1" w:unhideWhenUsed="1"/>
-    <w:lsdException w:name="Table Simple 1" w:semiHidden="1" w:unhideWhenUsed="1"/>
-    <w:lsdException w:name="Table Simple 2" w:semiHidden="1" w:unhideWhenUsed="1"/>
-    <w:lsdException w:name="Table Simple 3" w:semiHidden="1" w:unhideWhenUsed="1"/>
-    <w:lsdException w:name="Table Classic 1" w:semiHidden="1" w:unhideWhenUsed="1"/>
-    <w:lsdException w:name="Table Classic 2" w:semiHidden="1" w:unhideWhenUsed="1"/>
-    <w:lsdException w:name="Table Classic 3" w:semiHidden="1" w:unhideWhenUsed="1"/>
-    <w:lsdException w:name="Table Classic 4" w:semiHidden="1" w:unhideWhenUsed="1"/>
-    <w:lsdException w:name="Table Colorful 1" w:semiHidden="1" w:unhideWhenUsed="1"/>
-    <w:lsdException w:name="Table Colorful 2" w:semiHidden="1" w:unhideWhenUsed="1"/>
-    <w:lsdException w:name="Table Colorful 3" w:semiHidden="1" w:unhideWhenUsed="1"/>
-    <w:lsdException w:name="Table Columns 1" w:semiHidden="1" w:unhideWhenUsed="1"/>
-    <w:lsdException w:name="Table Columns 2" w:semiHidden="1" w:unhideWhenUsed="1"/>
-    <w:lsdException w:name="Table Columns 3" w:semiHidden="1" w:unhideWhenUsed="1"/>
-    <w:lsdException w:name="Table Columns 4" w:semiHidden="1" w:unhideWhenUsed="1"/>
-    <w:lsdException w:name="Table Columns 5" w:semiHidden="1" w:unhideWhenUsed="1"/>
-    <w:lsdException w:name="Table Grid 1" w:semiHidden="1" w:unhideWhenUsed="1"/>
-    <w:lsdException w:name="Table Grid 2" w:semiHidden="1" w:unhideWhenUsed="1"/>
-    <w:lsdException w:name="Table Grid 3" w:semiHidden="1" w:unhideWhenUsed="1"/>
-    <w:lsdException w:name="Table Grid 4" w:semiHidden="1" w:unhideWhenUsed="1"/>
-    <w:lsdException w:name="Table Grid 5" w:semiHidden="1" w:unhideWhenUsed="1"/>
-    <w:lsdException w:name="Table Grid 6" w:semiHidden="1" w:unhideWhenUsed="1"/>
-    <w:lsdException w:name="Table Grid 7" w:semiHidden="1" w:unhideWhenUsed="1"/>
-    <w:lsdException w:name="Table Grid 8" w:semiHidden="1" w:unhideWhenUsed="1"/>
-    <w:lsdException w:name="Table List 1" w:semiHidden="1" w:unhideWhenUsed="1"/>
-    <w:lsdException w:name="Table List 2" w:semiHidden="1" w:unhideWhenUsed="1"/>
-    <w:lsdException w:name="Table List 3" w:semiHidden="1" w:unhideWhenUsed="1"/>
-    <w:lsdException w:name="Table List 4" w:semiHidden="1" w:unhideWhenUsed="1"/>
-    <w:lsdException w:name="Table List 5" w:semiHidden="1" w:unhideWhenUsed="1"/>
-    <w:lsdException w:name="Table List 6" w:semiHidden="1" w:unhideWhenUsed="1"/>
-    <w:lsdException w:name="Table List 7" w:semiHidden="1" w:unhideWhenUsed="1"/>
-    <w:lsdException w:name="Table List 8" w:semiHidden="1" w:unhideWhenUsed="1"/>
-    <w:lsdException w:name="Table 3D effects 1" w:semiHidden="1" w:unhideWhenUsed="1"/>
-    <w:lsdException w:name="Table 3D effects 2" w:semiHidden="1" w:unhideWhenUsed="1"/>
-    <w:lsdException w:name="Table 3D effects 3" w:semiHidden="1" w:unhideWhenUsed="1"/>
-    <w:lsdException w:name="Table Contemporary" w:semiHidden="1" w:unhideWhenUsed="1"/>
-    <w:lsdException w:name="Table Elegant" w:semiHidden="1" w:unhideWhenUsed="1"/>
-    <w:lsdException w:name="Table Professional" w:semiHidden="1" w:unhideWhenUsed="1"/>
-    <w:lsdException w:name="Table Subtle 1" w:semiHidden="1" w:unhideWhenUsed="1"/>
-    <w:lsdException w:name="Table Subtle 2" w:semiHidden="1" w:unhideWhenUsed="1"/>
-    <w:lsdException w:name="Table Web 1" w:semiHidden="1" w:unhideWhenUsed="1"/>
-    <w:lsdException w:name="Table Web 2" w:semiHidden="1" w:unhideWhenUsed="1"/>
-    <w:lsdException w:name="Table Web 3" w:semiHidden="1" w:unhideWhenUsed="1"/>
-    <w:lsdException w:name="Balloon Text" w:semiHidden="1" w:unhideWhenUsed="1"/>
-    <w:lsdException w:name="Table Grid" w:uiPriority="39"/>
-    <w:lsdException w:name="Table Theme" w:semiHidden="1" w:unhideWhenUsed="1"/>
-    <w:lsdException w:name="Placeholder Text" w:semiHidden="1"/>
-    <w:lsdException w:name="No Spacing" w:uiPriority="1" w:qFormat="1"/>
-    <w:lsdException w:name="Light Shading" w:uiPriority="60"/>
-    <w:lsdException w:name="Light List" w:uiPriority="61"/>
-    <w:lsdException w:name="Light Grid" w:uiPriority="62"/>
-    <w:lsdException w:name="Medium Shading 1" w:uiPriority="63"/>
-    <w:lsdException w:name="Medium Shading 2" w:uiPriority="64"/>
-    <w:lsdException w:name="Medium List 1" w:uiPriority="65"/>
-    <w:lsdException w:name="Medium List 2" w:uiPriority="66"/>
-    <w:lsdException w:name="Medium Grid 1" w:uiPriority="67"/>
-    <w:lsdException w:name="Medium Grid 2" w:uiPriority="68"/>
-    <w:lsdException w:name="Medium Grid 3" w:uiPriority="69"/>
-    <w:lsdException w:name="Dark List" w:uiPriority="70"/>
-    <w:lsdException w:name="Colorful Shading" w:uiPriority="71"/>
-    <w:lsdException w:name="Colorful List" w:uiPriority="72"/>
-    <w:lsdException w:name="Colorful Grid" w:uiPriority="73"/>
-    <w:lsdException w:name="Light Shading Accent 1" w:uiPriority="60"/>
-    <w:lsdException w:name="Light List Accent 1" w:uiPriority="61"/>
-    <w:lsdException w:name="Light Grid Accent 1" w:uiPriority="62"/>
-    <w:lsdException w:name="Medium Shading 1 Accent 1" w:uiPriority="63"/>
-    <w:lsdException w:name="Medium Shading 2 Accent 1" w:uiPriority="64"/>
-    <w:lsdException w:name="Medium List 1 Accent 1" w:uiPriority="65"/>
-    <w:lsdException w:name="Revision" w:semiHidden="1"/>
-    <w:lsdException w:name="List Paragraph" w:uiPriority="34" w:qFormat="1"/>
-    <w:lsdException w:name="Quote" w:uiPriority="29" w:qFormat="1"/>
-    <w:lsdException w:name="Intense Quote" w:uiPriority="30" w:qFormat="1"/>
-    <w:lsdException w:name="Medium List 2 Accent 1" w:uiPriority="66"/>
-    <w:lsdException w:name="Medium Grid 1 Accent 1" w:uiPriority="67"/>
-    <w:lsdException w:name="Medium Grid 2 Accent 1" w:uiPriority="68"/>
-    <w:lsdException w:name="Medium Grid 3 Accent 1" w:uiPriority="69"/>
-    <w:lsdException w:name="Dark List Accent 1" w:uiPriority="70"/>
-    <w:lsdException w:name="Colorful Shading Accent 1" w:uiPriority="71"/>
-    <w:lsdException w:name="Colorful List Accent 1" w:uiPriority="72"/>
-    <w:lsdException w:name="Colorful Grid Accent 1" w:uiPriority="73"/>
-    <w:lsdException w:name="Light Shading Accent 2" w:uiPriority="60"/>
-    <w:lsdException w:name="Light List Accent 2" w:uiPriority="61"/>
-    <w:lsdException w:name="Light Grid Accent 2" w:uiPriority="62"/>
-    <w:lsdException w:name="Medium Shading 1 Accent 2" w:uiPriority="63"/>
-    <w:lsdException w:name="Medium Shading 2 Accent 2" w:uiPriority="64"/>
-    <w:lsdException w:name="Medium List 1 Accent 2" w:uiPriority="65"/>
-    <w:lsdException w:name="Medium List 2 Accent 2" w:uiPriority="66"/>
-    <w:lsdException w:name="Medium Grid 1 Accent 2" w:uiPriority="67"/>
-    <w:lsdException w:name="Medium Grid 2 Accent 2" w:uiPriority="68"/>
-    <w:lsdException w:name="Medium Grid 3 Accent 2" w:uiPriority="69"/>
-    <w:lsdException w:name="Dark List Accent 2" w:uiPriority="70"/>
-    <w:lsdException w:name="Colorful Shading Accent 2" w:uiPriority="71"/>
-    <w:lsdException w:name="Colorful List Accent 2" w:uiPriority="72"/>
-    <w:lsdException w:name="Colorful Grid Accent 2" w:uiPriority="73"/>
-    <w:lsdException w:name="Light Shading Accent 3" w:uiPriority="60"/>
-    <w:lsdException w:name="Light List Accent 3" w:uiPriority="61"/>
-    <w:lsdException w:name="Light Grid Accent 3" w:uiPriority="62"/>
-    <w:lsdException w:name="Medium Shading 1 Accent 3" w:uiPriority="63"/>
-    <w:lsdException w:name="Medium Shading 2 Accent 3" w:uiPriority="64"/>
-    <w:lsdException w:name="Medium List 1 Accent 3" w:uiPriority="65"/>
-    <w:lsdException w:name="Medium List 2 Accent 3" w:uiPriority="66"/>
-    <w:lsdException w:name="Medium Grid 1 Accent 3" w:uiPriority="67"/>
-    <w:lsdException w:name="Medium Grid 2 Accent 3" w:uiPriority="68"/>
-    <w:lsdException w:name="Medium Grid 3 Accent 3" w:uiPriority="69"/>
-    <w:lsdException w:name="Dark List Accent 3" w:uiPriority="70"/>
-    <w:lsdException w:name="Colorful Shading Accent 3" w:uiPriority="71"/>
-    <w:lsdException w:name="Colorful List Accent 3" w:uiPriority="72"/>
-    <w:lsdException w:name="Colorful Grid Accent 3" w:uiPriority="73"/>
-    <w:lsdException w:name="Light Shading Accent 4" w:uiPriority="60"/>
-    <w:lsdException w:name="Light List Accent 4" w:uiPriority="61"/>
-    <w:lsdException w:name="Light Grid Accent 4" w:uiPriority="62"/>
-    <w:lsdException w:name="Medium Shading 1 Accent 4" w:uiPriority="63"/>
-    <w:lsdException w:name="Medium Shading 2 Accent 4" w:uiPriority="64"/>
-    <w:lsdException w:name="Medium List 1 Accent 4" w:uiPriority="65"/>
-    <w:lsdException w:name="Medium List 2 Accent 4" w:uiPriority="66"/>
-    <w:lsdException w:name="Medium Grid 1 Accent 4" w:uiPriority="67"/>
-    <w:lsdException w:name="Medium Grid 2 Accent 4" w:uiPriority="68"/>
-    <w:lsdException w:name="Medium Grid 3 Accent 4" w:uiPriority="69"/>
-    <w:lsdException w:name="Dark List Accent 4" w:uiPriority="70"/>
-    <w:lsdException w:name="Colorful Shading Accent 4" w:uiPriority="71"/>
-    <w:lsdException w:name="Colorful List Accent 4" w:uiPriority="72"/>
-    <w:lsdException w:name="Colorful Grid Accent 4" w:uiPriority="73"/>
-    <w:lsdException w:name="Light Shading Accent 5" w:uiPriority="60"/>
-    <w:lsdException w:name="Light List Accent 5" w:uiPriority="61"/>
-    <w:lsdException w:name="Light Grid Accent 5" w:uiPriority="62"/>
-    <w:lsdException w:name="Medium Shading 1 Accent 5" w:uiPriority="63"/>
-    <w:lsdException w:name="Medium Shading 2 Accent 5" w:uiPriority="64"/>
-    <w:lsdException w:name="Medium List 1 Accent 5" w:uiPriority="65"/>
-    <w:lsdException w:name="Medium List 2 Accent 5" w:uiPriority="66"/>
-    <w:lsdException w:name="Medium Grid 1 Accent 5" w:uiPriority="67"/>
-    <w:lsdException w:name="Medium Grid 2 Accent 5" w:uiPriority="68"/>
-    <w:lsdException w:name="Medium Grid 3 Accent 5" w:uiPriority="69"/>
-    <w:lsdException w:name="Dark List Accent 5" w:uiPriority="70"/>
-    <w:lsdException w:name="Colorful Shading Accent 5" w:uiPriority="71"/>
-    <w:lsdException w:name="Colorful List Accent 5" w:uiPriority="72"/>
-    <w:lsdException w:name="Colorful Grid Accent 5" w:uiPriority="73"/>
-    <w:lsdException w:name="Light Shading Accent 6" w:uiPriority="60"/>
-    <w:lsdException w:name="Light List Accent 6" w:uiPriority="61"/>
-    <w:lsdException w:name="Light Grid Accent 6" w:uiPriority="62"/>
-    <w:lsdException w:name="Medium Shading 1 Accent 6" w:uiPriority="63"/>
-    <w:lsdException w:name="Medium Shading 2 Accent 6" w:uiPriority="64"/>
-    <w:lsdException w:name="Medium List 1 Accent 6" w:uiPriority="65"/>
-    <w:lsdException w:name="Medium List 2 Accent 6" w:uiPriority="66"/>
-    <w:lsdException w:name="Medium Grid 1 Accent 6" w:uiPriority="67"/>
-    <w:lsdException w:name="Medium Grid 2 Accent 6" w:uiPriority="68"/>
-    <w:lsdException w:name="Medium Grid 3 Accent 6" w:uiPriority="69"/>
-    <w:lsdException w:name="Dark List Accent 6" w:uiPriority="70"/>
-    <w:lsdException w:name="Colorful Shading Accent 6" w:uiPriority="71"/>
-    <w:lsdException w:name="Colorful List Accent 6" w:uiPriority="72"/>
-    <w:lsdException w:name="Colorful Grid Accent 6" w:uiPriority="73"/>
-    <w:lsdException w:name="Subtle Emphasis" w:uiPriority="19" w:qFormat="1"/>
-    <w:lsdException w:name="Intense Emphasis" w:uiPriority="21" w:qFormat="1"/>
-    <w:lsdException w:name="Subtle Reference" w:uiPriority="31" w:qFormat="1"/>
-    <w:lsdException w:name="Intense Reference" w:uiPriority="32" w:qFormat="1"/>
-    <w:lsdException w:name="Book Title" w:uiPriority="33" w:qFormat="1"/>
-    <w:lsdException w:name="Bibliography" w:semiHidden="1" w:uiPriority="37" w:unhideWhenUsed="1"/>
-    <w:lsdException w:name="TOC Heading" w:semiHidden="1" w:uiPriority="39" w:unhideWhenUsed="1" w:qFormat="1"/>
-    <w:lsdException w:name="Plain Table 1" w:uiPriority="41"/>
-    <w:lsdException w:name="Plain Table 2" w:uiPriority="42"/>
-    <w:lsdException w:name="Plain Table 3" w:uiPriority="43"/>
-    <w:lsdException w:name="Plain Table 4" w:uiPriority="44"/>
-    <w:lsdException w:name="Plain Table 5" w:uiPriority="45"/>
-    <w:lsdException w:name="Grid Table Light" w:uiPriority="40"/>
-    <w:lsdException w:name="Grid Table 1 Light" w:uiPriority="46"/>
-    <w:lsdException w:name="Grid Table 2" w:uiPriority="47"/>
-    <w:lsdException w:name="Grid Table 3" w:uiPriority="48"/>
-    <w:lsdException w:name="Grid Table 4" w:uiPriority="49"/>
-    <w:lsdException w:name="Grid Table 5 Dark" w:uiPriority="50"/>
-    <w:lsdException w:name="Grid Table 6 Colorful" w:uiPriority="51"/>
-    <w:lsdException w:name="Grid Table 7 Colorful" w:uiPriority="52"/>
-    <w:lsdException w:name="Grid Table 1 Light Accent 1" w:uiPriority="46"/>
-    <w:lsdException w:name="Grid Table 2 Accent 1" w:uiPriority="47"/>
-    <w:lsdException w:name="Grid Table 3 Accent 1" w:uiPriority="48"/>
-    <w:lsdException w:name="Grid Table 4 Accent 1" w:uiPriority="49"/>
-    <w:lsdException w:name="Grid Table 5 Dark Accent 1" w:uiPriority="50"/>
-    <w:lsdException w:name="Grid Table 6 Colorful Accent 1" w:uiPriority="51"/>
-    <w:lsdException w:name="Grid Table 7 Colorful Accent 1" w:uiPriority="52"/>
-    <w:lsdException w:name="Grid Table 1 Light Accent 2" w:uiPriority="46"/>
-    <w:lsdException w:name="Grid Table 2 Accent 2" w:uiPriority="47"/>
-    <w:lsdException w:name="Grid Table 3 Accent 2" w:uiPriority="48"/>
-    <w:lsdException w:name="Grid Table 4 Accent 2" w:uiPriority="49"/>
-    <w:lsdException w:name="Grid Table 5 Dark Accent 2" w:uiPriority="50"/>
-    <w:lsdException w:name="Grid Table 6 Colorful Accent 2" w:uiPriority="51"/>
-    <w:lsdException w:name="Grid Table 7 Colorful Accent 2" w:uiPriority="52"/>
-    <w:lsdException w:name="Grid Table 1 Light Accent 3" w:uiPriority="46"/>
-    <w:lsdException w:name="Grid Table 2 Accent 3" w:uiPriority="47"/>
-    <w:lsdException w:name="Grid Table 3 Accent 3" w:uiPriority="48"/>
-    <w:lsdException w:name="Grid Table 4 Accent 3" w:uiPriority="49"/>
-    <w:lsdException w:name="Grid Table 5 Dark Accent 3" w:uiPriority="50"/>
-    <w:lsdException w:name="Grid Table 6 Colorful Accent 3" w:uiPriority="51"/>
-    <w:lsdException w:name="Grid Table 7 Colorful Accent 3" w:uiPriority="52"/>
-    <w:lsdException w:name="Grid Table 1 Light Accent 4" w:uiPriority="46"/>
-    <w:lsdException w:name="Grid Table 2 Accent 4" w:uiPriority="47"/>
-    <w:lsdException w:name="Grid Table 3 Accent 4" w:uiPriority="48"/>
-    <w:lsdException w:name="Grid Table 4 Accent 4" w:uiPriority="49"/>
-    <w:lsdException w:name="Grid Table 5 Dark Accent 4" w:uiPriority="50"/>
-    <w:lsdException w:name="Grid Table 6 Colorful Accent 4" w:uiPriority="51"/>
-    <w:lsdException w:name="Grid Table 7 Colorful Accent 4" w:uiPriority="52"/>
-    <w:lsdException w:name="Grid Table 1 Light Accent 5" w:uiPriority="46"/>
-    <w:lsdException w:name="Grid Table 2 Accent 5" w:uiPriority="47"/>
-    <w:lsdException w:name="Grid Table 3 Accent 5" w:uiPriority="48"/>
-    <w:lsdException w:name="Grid Table 4 Accent 5" w:uiPriority="49"/>
-    <w:lsdException w:name="Grid Table 5 Dark Accent 5" w:uiPriority="50"/>
-    <w:lsdException w:name="Grid Table 6 Colorful Accent 5" w:uiPriority="51"/>
-    <w:lsdException w:name="Grid Table 7 Colorful Accent 5" w:uiPriority="52"/>
-    <w:lsdException w:name="Grid Table 1 Light Accent 6" w:uiPriority="46"/>
-    <w:lsdException w:name="Grid Table 2 Accent 6" w:uiPriority="47"/>
-    <w:lsdException w:name="Grid Table 3 Accent 6" w:uiPriority="48"/>
-    <w:lsdException w:name="Grid Table 4 Accent 6" w:uiPriority="49"/>
-    <w:lsdException w:name="Grid Table 5 Dark Accent 6" w:uiPriority="50"/>
-    <w:lsdException w:name="Grid Table 6 Colorful Accent 6" w:uiPriority="51"/>
-    <w:lsdException w:name="Grid Table 7 Colorful Accent 6" w:uiPriority="52"/>
-    <w:lsdException w:name="List Table 1 Light" w:uiPriority="46"/>
-    <w:lsdException w:name="List Table 2" w:uiPriority="47"/>
-    <w:lsdException w:name="List Table 3" w:uiPriority="48"/>
-    <w:lsdException w:name="List Table 4" w:uiPriority="49"/>
-    <w:lsdException w:name="List Table 5 Dark" w:uiPriority="50"/>
-    <w:lsdException w:name="List Table 6 Colorful" w:uiPriority="51"/>
-    <w:lsdException w:name="List Table 7 Colorful" w:uiPriority="52"/>
-    <w:lsdException w:name="List Table 1 Light Accent 1" w:uiPriority="46"/>
-    <w:lsdException w:name="List Table 2 Accent 1" w:uiPriority="47"/>
-    <w:lsdException w:name="List Table 3 Accent 1" w:uiPriority="48"/>
-    <w:lsdException w:name="List Table 4 Accent 1" w:uiPriority="49"/>
-    <w:lsdException w:name="List Table 5 Dark Accent 1" w:uiPriority="50"/>
-    <w:lsdException w:name="List Table 6 Colorful Accent 1" w:uiPriority="51"/>
-    <w:lsdException w:name="List Table 7 Colorful Accent 1" w:uiPriority="52"/>
-    <w:lsdException w:name="List Table 1 Light Accent 2" w:uiPriority="46"/>
-    <w:lsdException w:name="List Table 2 Accent 2" w:uiPriority="47"/>
-    <w:lsdException w:name="List Table 3 Accent 2" w:uiPriority="48"/>
-    <w:lsdException w:name="List Table 4 Accent 2" w:uiPriority="49"/>
-    <w:lsdException w:name="List Table 5 Dark Accent 2" w:uiPriority="50"/>
-    <w:lsdException w:name="List Table 6 Colorful Accent 2" w:uiPriority="51"/>
-    <w:lsdException w:name="List Table 7 Colorful Accent 2" w:uiPriority="52"/>
-    <w:lsdException w:name="List Table 1 Light Accent 3" w:uiPriority="46"/>
-    <w:lsdException w:name="List Table 2 Accent 3" w:uiPriority="47"/>
-    <w:lsdException w:name="List Table 3 Accent 3" w:uiPriority="48"/>
-    <w:lsdException w:name="List Table 4 Accent 3" w:uiPriority="49"/>
-    <w:lsdException w:name="List Table 5 Dark Accent 3" w:uiPriority="50"/>
-    <w:lsdException w:name="List Table 6 Colorful Accent 3" w:uiPriority="51"/>
-    <w:lsdException w:name="List Table 7 Colorful Accent 3" w:uiPriority="52"/>
-    <w:lsdException w:name="List Table 1 Light Accent 4" w:uiPriority="46"/>
-    <w:lsdException w:name="List Table 2 Accent 4" w:uiPriority="47"/>
-    <w:lsdException w:name="List Table 3 Accent 4" w:uiPriority="48"/>
-    <w:lsdException w:name="List Table 4 Accent 4" w:uiPriority="49"/>
-    <w:lsdException w:name="List Table 5 Dark Accent 4" w:uiPriority="50"/>
-    <w:lsdException w:name="List Table 6 Colorful Accent 4" w:uiPriority="51"/>
-    <w:lsdException w:name="List Table 7 Colorful Accent 4" w:uiPriority="52"/>
-    <w:lsdException w:name="List Table 1 Light Accent 5" w:uiPriority="46"/>
-    <w:lsdException w:name="List Table 2 Accent 5" w:uiPriority="47"/>
-    <w:lsdException w:name="List Table 3 Accent 5" w:uiPriority="48"/>
-    <w:lsdException w:name="List Table 4 Accent 5" w:uiPriority="49"/>
-    <w:lsdException w:name="List Table 5 Dark Accent 5" w:uiPriority="50"/>
-    <w:lsdException w:name="List Table 6 Colorful Accent 5" w:uiPriority="51"/>
-    <w:lsdException w:name="List Table 7 Colorful Accent 5" w:uiPriority="52"/>
-    <w:lsdException w:name="List Table 1 Light Accent 6" w:uiPriority="46"/>
-    <w:lsdException w:name="List Table 2 Accent 6" w:uiPriority="47"/>
-    <w:lsdException w:name="List Table 3 Accent 6" w:uiPriority="48"/>
-    <w:lsdException w:name="List Table 4 Accent 6" w:uiPriority="49"/>
-    <w:lsdException w:name="List Table 5 Dark Accent 6" w:uiPriority="50"/>
-    <w:lsdException w:name="List Table 6 Colorful Accent 6" w:uiPriority="51"/>
-    <w:lsdException w:name="List Table 7 Colorful Accent 6" w:uiPriority="52"/>
-    <w:lsdException w:name="Mention" w:semiHidden="1" w:unhideWhenUsed="1"/>
-    <w:lsdException w:name="Smart Hyperlink" w:semiHidden="1" w:unhideWhenUsed="1"/>
-    <w:lsdException w:name="Hashtag" w:semiHidden="1" w:unhideWhenUsed="1"/>
-    <w:lsdException w:name="Unresolved Mention" w:semiHidden="1" w:unhideWhenUsed="1"/>
-    <w:lsdException w:name="Smart Link" w:semiHidden="1" w:unhideWhenUsed="1"/>
+  <w:latentStyles w:defLockedState="0" w:defUIPriority="99" w:defSemiHidden="1" w:defUnhideWhenUsed="1" w:defQFormat="0" w:count="267">
+    <w:lsdException w:name="Normal" w:semiHidden="0" w:uiPriority="0" w:unhideWhenUsed="0" w:qFormat="1"/>
+    <w:lsdException w:name="heading 1" w:semiHidden="0" w:uiPriority="9" w:unhideWhenUsed="0" w:qFormat="1"/>
+    <w:lsdException w:name="heading 2" w:uiPriority="9" w:qFormat="1"/>
+    <w:lsdException w:name="heading 3" w:uiPriority="9" w:qFormat="1"/>
+    <w:lsdException w:name="heading 4" w:uiPriority="9" w:qFormat="1"/>
+    <w:lsdException w:name="heading 5" w:uiPriority="9" w:qFormat="1"/>
+    <w:lsdException w:name="heading 6" w:uiPriority="9" w:qFormat="1"/>
+    <w:lsdException w:name="heading 7" w:uiPriority="9" w:qFormat="1"/>
+    <w:lsdException w:name="heading 8" w:uiPriority="9" w:qFormat="1"/>
+    <w:lsdException w:name="heading 9" w:uiPriority="9" w:qFormat="1"/>
+    <w:lsdException w:name="toc 1" w:uiPriority="39"/>
+    <w:lsdException w:name="toc 2" w:uiPriority="39"/>
+    <w:lsdException w:name="toc 3" w:uiPriority="39"/>
+    <w:lsdException w:name="toc 4" w:uiPriority="39"/>
+    <w:lsdException w:name="toc 5" w:uiPriority="39"/>
+    <w:lsdException w:name="toc 6" w:uiPriority="39"/>
+    <w:lsdException w:name="toc 7" w:uiPriority="39"/>
+    <w:lsdException w:name="toc 8" w:uiPriority="39"/>
+    <w:lsdException w:name="toc 9" w:uiPriority="39"/>
+    <w:lsdException w:name="caption" w:uiPriority="35" w:qFormat="1"/>
+    <w:lsdException w:name="Title" w:semiHidden="0" w:uiPriority="10" w:unhideWhenUsed="0" w:qFormat="1"/>
+    <w:lsdException w:name="Default Paragraph Font" w:uiPriority="1"/>
+    <w:lsdException w:name="Subtitle" w:semiHidden="0" w:uiPriority="11" w:unhideWhenUsed="0" w:qFormat="1"/>
+    <w:lsdException w:name="Strong" w:semiHidden="0" w:uiPriority="22" w:unhideWhenUsed="0" w:qFormat="1"/>
+    <w:lsdException w:name="Emphasis" w:semiHidden="0" w:uiPriority="20" w:unhideWhenUsed="0" w:qFormat="1"/>
+    <w:lsdException w:name="Table Grid" w:semiHidden="0" w:uiPriority="39" w:unhideWhenUsed="0"/>
+    <w:lsdException w:name="Placeholder Text" w:unhideWhenUsed="0"/>
+    <w:lsdException w:name="No Spacing" w:semiHidden="0" w:uiPriority="1" w:unhideWhenUsed="0" w:qFormat="1"/>
+    <w:lsdException w:name="Light Shading" w:semiHidden="0" w:uiPriority="60" w:unhideWhenUsed="0"/>
+    <w:lsdException w:name="Light List" w:semiHidden="0" w:uiPriority="61" w:unhideWhenUsed="0"/>
+    <w:lsdException w:name="Light Grid" w:semiHidden="0" w:uiPriority="62" w:unhideWhenUsed="0"/>
+    <w:lsdException w:name="Medium Shading 1" w:semiHidden="0" w:uiPriority="63" w:unhideWhenUsed="0"/>
+    <w:lsdException w:name="Medium Shading 2" w:semiHidden="0" w:uiPriority="64" w:unhideWhenUsed="0"/>
+    <w:lsdException w:name="Medium List 1" w:semiHidden="0" w:uiPriority="65" w:unhideWhenUsed="0"/>
+    <w:lsdException w:name="Medium List 2" w:semiHidden="0" w:uiPriority="66" w:unhideWhenUsed="0"/>
+    <w:lsdException w:name="Medium Grid 1" w:semiHidden="0" w:uiPriority="67" w:unhideWhenUsed="0"/>
+    <w:lsdException w:name="Medium Grid 2" w:semiHidden="0" w:uiPriority="68" w:unhideWhenUsed="0"/>
+    <w:lsdException w:name="Medium Grid 3" w:semiHidden="0" w:uiPriority="69" w:unhideWhenUsed="0"/>
+    <w:lsdException w:name="Dark List" w:semiHidden="0" w:uiPriority="70" w:unhideWhenUsed="0"/>
+    <w:lsdException w:name="Colorful Shading" w:semiHidden="0" w:uiPriority="71" w:unhideWhenUsed="0"/>
+    <w:lsdException w:name="Colorful List" w:semiHidden="0" w:uiPriority="72" w:unhideWhenUsed="0"/>
+    <w:lsdException w:name="Colorful Grid" w:semiHidden="0" w:uiPriority="73" w:unhideWhenUsed="0"/>
+    <w:lsdException w:name="Light Shading Accent 1" w:semiHidden="0" w:uiPriority="60" w:unhideWhenUsed="0"/>
+    <w:lsdException w:name="Light List Accent 1" w:semiHidden="0" w:uiPriority="61" w:unhideWhenUsed="0"/>
+    <w:lsdException w:name="Light Grid Accent 1" w:semiHidden="0" w:uiPriority="62" w:unhideWhenUsed="0"/>
+    <w:lsdException w:name="Medium Shading 1 Accent 1" w:semiHidden="0" w:uiPriority="63" w:unhideWhenUsed="0"/>
+    <w:lsdException w:name="Medium Shading 2 Accent 1" w:semiHidden="0" w:uiPriority="64" w:unhideWhenUsed="0"/>
+    <w:lsdException w:name="Medium List 1 Accent 1" w:semiHidden="0" w:uiPriority="65" w:unhideWhenUsed="0"/>
+    <w:lsdException w:name="Revision" w:unhideWhenUsed="0"/>
+    <w:lsdException w:name="List Paragraph" w:semiHidden="0" w:uiPriority="34" w:unhideWhenUsed="0" w:qFormat="1"/>
+    <w:lsdException w:name="Quote" w:semiHidden="0" w:uiPriority="29" w:unhideWhenUsed="0" w:qFormat="1"/>
+    <w:lsdException w:name="Intense Quote" w:semiHidden="0" w:uiPriority="30" w:unhideWhenUsed="0" w:qFormat="1"/>
+    <w:lsdException w:name="Medium List 2 Accent 1" w:semiHidden="0" w:uiPriority="66" w:unhideWhenUsed="0"/>
+    <w:lsdException w:name="Medium Grid 1 Accent 1" w:semiHidden="0" w:uiPriority="67" w:unhideWhenUsed="0"/>
+    <w:lsdException w:name="Medium Grid 2 Accent 1" w:semiHidden="0" w:uiPriority="68" w:unhideWhenUsed="0"/>
+    <w:lsdException w:name="Medium Grid 3 Accent 1" w:semiHidden="0" w:uiPriority="69" w:unhideWhenUsed="0"/>
+    <w:lsdException w:name="Dark List Accent 1" w:semiHidden="0" w:uiPriority="70" w:unhideWhenUsed="0"/>
+    <w:lsdException w:name="Colorful Shading Accent 1" w:semiHidden="0" w:uiPriority="71" w:unhideWhenUsed="0"/>
+    <w:lsdException w:name="Colorful List Accent 1" w:semiHidden="0" w:uiPriority="72" w:unhideWhenUsed="0"/>
+    <w:lsdException w:name="Colorful Grid Accent 1" w:semiHidden="0" w:uiPriority="73" w:unhideWhenUsed="0"/>
+    <w:lsdException w:name="Light Shading Accent 2" w:semiHidden="0" w:uiPriority="60" w:unhideWhenUsed="0"/>
+    <w:lsdException w:name="Light List Accent 2" w:semiHidden="0" w:uiPriority="61" w:unhideWhenUsed="0"/>
+    <w:lsdException w:name="Light Grid Accent 2" w:semiHidden="0" w:uiPriority="62" w:unhideWhenUsed="0"/>
+    <w:lsdException w:name="Medium Shading 1 Accent 2" w:semiHidden="0" w:uiPriority="63" w:unhideWhenUsed="0"/>
+    <w:lsdException w:name="Medium Shading 2 Accent 2" w:semiHidden="0" w:uiPriority="64" w:unhideWhenUsed="0"/>
+    <w:lsdException w:name="Medium List 1 Accent 2" w:semiHidden="0" w:uiPriority="65" w:unhideWhenUsed="0"/>
+    <w:lsdException w:name="Medium List 2 Accent 2" w:semiHidden="0" w:uiPriority="66" w:unhideWhenUsed="0"/>
+    <w:lsdException w:name="Medium Grid 1 Accent 2" w:semiHidden="0" w:uiPriority="67" w:unhideWhenUsed="0"/>
+    <w:lsdException w:name="Medium Grid 2 Accent 2" w:semiHidden="0" w:uiPriority="68" w:unhideWhenUsed="0"/>
+    <w:lsdException w:name="Medium Grid 3 Accent 2" w:semiHidden="0" w:uiPriority="69" w:unhideWhenUsed="0"/>
+    <w:lsdException w:name="Dark List Accent 2" w:semiHidden="0" w:uiPriority="70" w:unhideWhenUsed="0"/>
+    <w:lsdException w:name="Colorful Shading Accent 2" w:semiHidden="0" w:uiPriority="71" w:unhideWhenUsed="0"/>
+    <w:lsdException w:name="Colorful List Accent 2" w:semiHidden="0" w:uiPriority="72" w:unhideWhenUsed="0"/>
+    <w:lsdException w:name="Colorful Grid Accent 2" w:semiHidden="0" w:uiPriority="73" w:unhideWhenUsed="0"/>
+    <w:lsdException w:name="Light Shading Accent 3" w:semiHidden="0" w:uiPriority="60" w:unhideWhenUsed="0"/>
+    <w:lsdException w:name="Light List Accent 3" w:semiHidden="0" w:uiPriority="61" w:unhideWhenUsed="0"/>
+    <w:lsdException w:name="Light Grid Accent 3" w:semiHidden="0" w:uiPriority="62" w:unhideWhenUsed="0"/>
+    <w:lsdException w:name="Medium Shading 1 Accent 3" w:semiHidden="0" w:uiPriority="63" w:unhideWhenUsed="0"/>
+    <w:lsdException w:name="Medium Shading 2 Accent 3" w:semiHidden="0" w:uiPriority="64" w:unhideWhenUsed="0"/>
+    <w:lsdException w:name="Medium List 1 Accent 3" w:semiHidden="0" w:uiPriority="65" w:unhideWhenUsed="0"/>
+    <w:lsdException w:name="Medium List 2 Accent 3" w:semiHidden="0" w:uiPriority="66" w:unhideWhenUsed="0"/>
+    <w:lsdException w:name="Medium Grid 1 Accent 3" w:semiHidden="0" w:uiPriority="67" w:unhideWhenUsed="0"/>
+    <w:lsdException w:name="Medium Grid 2 Accent 3" w:semiHidden="0" w:uiPriority="68" w:unhideWhenUsed="0"/>
+    <w:lsdException w:name="Medium Grid 3 Accent 3" w:semiHidden="0" w:uiPriority="69" w:unhideWhenUsed="0"/>
+    <w:lsdException w:name="Dark List Accent 3" w:semiHidden="0" w:uiPriority="70" w:unhideWhenUsed="0"/>
+    <w:lsdException w:name="Colorful Shading Accent 3" w:semiHidden="0" w:uiPriority="71" w:unhideWhenUsed="0"/>
+    <w:lsdException w:name="Colorful List Accent 3" w:semiHidden="0" w:uiPriority="72" w:unhideWhenUsed="0"/>
+    <w:lsdException w:name="Colorful Grid Accent 3" w:semiHidden="0" w:uiPriority="73" w:unhideWhenUsed="0"/>
+    <w:lsdException w:name="Light Shading Accent 4" w:semiHidden="0" w:uiPriority="60" w:unhideWhenUsed="0"/>
+    <w:lsdException w:name="Light List Accent 4" w:semiHidden="0" w:uiPriority="61" w:unhideWhenUsed="0"/>
+    <w:lsdException w:name="Light Grid Accent 4" w:semiHidden="0" w:uiPriority="62" w:unhideWhenUsed="0"/>
+    <w:lsdException w:name="Medium Shading 1 Accent 4" w:semiHidden="0" w:uiPriority="63" w:unhideWhenUsed="0"/>
+    <w:lsdException w:name="Medium Shading 2 Accent 4" w:semiHidden="0" w:uiPriority="64" w:unhideWhenUsed="0"/>
+    <w:lsdException w:name="Medium List 1 Accent 4" w:semiHidden="0" w:uiPriority="65" w:unhideWhenUsed="0"/>
+    <w:lsdException w:name="Medium List 2 Accent 4" w:semiHidden="0" w:uiPriority="66" w:unhideWhenUsed="0"/>
+    <w:lsdException w:name="Medium Grid 1 Accent 4" w:semiHidden="0" w:uiPriority="67" w:unhideWhenUsed="0"/>
+    <w:lsdException w:name="Medium Grid 2 Accent 4" w:semiHidden="0" w:uiPriority="68" w:unhideWhenUsed="0"/>
+    <w:lsdException w:name="Medium Grid 3 Accent 4" w:semiHidden="0" w:uiPriority="69" w:unhideWhenUsed="0"/>
+    <w:lsdException w:name="Dark List Accent 4" w:semiHidden="0" w:uiPriority="70" w:unhideWhenUsed="0"/>
+    <w:lsdException w:name="Colorful Shading Accent 4" w:semiHidden="0" w:uiPriority="71" w:unhideWhenUsed="0"/>
+    <w:lsdException w:name="Colorful List Accent 4" w:semiHidden="0" w:uiPriority="72" w:unhideWhenUsed="0"/>
+    <w:lsdException w:name="Colorful Grid Accent 4" w:semiHidden="0" w:uiPriority="73" w:unhideWhenUsed="0"/>
+    <w:lsdException w:name="Light Shading Accent 5" w:semiHidden="0" w:uiPriority="60" w:unhideWhenUsed="0"/>
+    <w:lsdException w:name="Light List Accent 5" w:semiHidden="0" w:uiPriority="61" w:unhideWhenUsed="0"/>
+    <w:lsdException w:name="Light Grid Accent 5" w:semiHidden="0" w:uiPriority="62" w:unhideWhenUsed="0"/>
+    <w:lsdException w:name="Medium Shading 1 Accent 5" w:semiHidden="0" w:uiPriority="63" w:unhideWhenUsed="0"/>
+    <w:lsdException w:name="Medium Shading 2 Accent 5" w:semiHidden="0" w:uiPriority="64" w:unhideWhenUsed="0"/>
+    <w:lsdException w:name="Medium List 1 Accent 5" w:semiHidden="0" w:uiPriority="65" w:unhideWhenUsed="0"/>
+    <w:lsdException w:name="Medium List 2 Accent 5" w:semiHidden="0" w:uiPriority="66" w:unhideWhenUsed="0"/>
+    <w:lsdException w:name="Medium Grid 1 Accent 5" w:semiHidden="0" w:uiPriority="67" w:unhideWhenUsed="0"/>
+    <w:lsdException w:name="Medium Grid 2 Accent 5" w:semiHidden="0" w:uiPriority="68" w:unhideWhenUsed="0"/>
+    <w:lsdException w:name="Medium Grid 3 Accent 5" w:semiHidden="0" w:uiPriority="69" w:unhideWhenUsed="0"/>
+    <w:lsdException w:name="Dark List Accent 5" w:semiHidden="0" w:uiPriority="70" w:unhideWhenUsed="0"/>
+    <w:lsdException w:name="Colorful Shading Accent 5" w:semiHidden="0" w:uiPriority="71" w:unhideWhenUsed="0"/>
+    <w:lsdException w:name="Colorful List Accent 5" w:semiHidden="0" w:uiPriority="72" w:unhideWhenUsed="0"/>
+    <w:lsdException w:name="Colorful Grid Accent 5" w:semiHidden="0" w:uiPriority="73" w:unhideWhenUsed="0"/>
+    <w:lsdException w:name="Light Shading Accent 6" w:semiHidden="0" w:uiPriority="60" w:unhideWhenUsed="0"/>
+    <w:lsdException w:name="Light List Accent 6" w:semiHidden="0" w:uiPriority="61" w:unhideWhenUsed="0"/>
+    <w:lsdException w:name="Light Grid Accent 6" w:semiHidden="0" w:uiPriority="62" w:unhideWhenUsed="0"/>
+    <w:lsdException w:name="Medium Shading 1 Accent 6" w:semiHidden="0" w:uiPriority="63" w:unhideWhenUsed="0"/>
+    <w:lsdException w:name="Medium Shading 2 Accent 6" w:semiHidden="0" w:uiPriority="64" w:unhideWhenUsed="0"/>
+    <w:lsdException w:name="Medium List 1 Accent 6" w:semiHidden="0" w:uiPriority="65" w:unhideWhenUsed="0"/>
+    <w:lsdException w:name="Medium List 2 Accent 6" w:semiHidden="0" w:uiPriority="66" w:unhideWhenUsed="0"/>
+    <w:lsdException w:name="Medium Grid 1 Accent 6" w:semiHidden="0" w:uiPriority="67" w:unhideWhenUsed="0"/>
+    <w:lsdException w:name="Medium Grid 2 Accent 6" w:semiHidden="0" w:uiPriority="68" w:unhideWhenUsed="0"/>
+    <w:lsdException w:name="Medium Grid 3 Accent 6" w:semiHidden="0" w:uiPriority="69" w:unhideWhenUsed="0"/>
+    <w:lsdException w:name="Dark List Accent 6" w:semiHidden="0" w:uiPriority="70" w:unhideWhenUsed="0"/>
+    <w:lsdException w:name="Colorful Shading Accent 6" w:semiHidden="0" w:uiPriority="71" w:unhideWhenUsed="0"/>
+    <w:lsdException w:name="Colorful List Accent 6" w:semiHidden="0" w:uiPriority="72" w:unhideWhenUsed="0"/>
+    <w:lsdException w:name="Colorful Grid Accent 6" w:semiHidden="0" w:uiPriority="73" w:unhideWhenUsed="0"/>
+    <w:lsdException w:name="Subtle Emphasis" w:semiHidden="0" w:uiPriority="19" w:unhideWhenUsed="0" w:qFormat="1"/>
+    <w:lsdException w:name="Intense Emphasis" w:semiHidden="0" w:uiPriority="21" w:unhideWhenUsed="0" w:qFormat="1"/>
+    <w:lsdException w:name="Subtle Reference" w:semiHidden="0" w:uiPriority="31" w:unhideWhenUsed="0" w:qFormat="1"/>
+    <w:lsdException w:name="Intense Reference" w:semiHidden="0" w:uiPriority="32" w:unhideWhenUsed="0" w:qFormat="1"/>
+    <w:lsdException w:name="Book Title" w:semiHidden="0" w:uiPriority="33" w:unhideWhenUsed="0" w:qFormat="1"/>
+    <w:lsdException w:name="Bibliography" w:uiPriority="37"/>
+    <w:lsdException w:name="TOC Heading" w:uiPriority="39" w:qFormat="1"/>
   </w:latentStyles>
   <w:style w:type="paragraph" w:default="1" w:styleId="Normal">
     <w:name w:val="Normal"/>
@@ -7315,6 +6895,12 @@
     <w:tblPr>
       <w:tblStyleRowBandSize w:val="1"/>
       <w:tblStyleColBandSize w:val="1"/>
+      <w:tblCellMar>
+        <w:top w:w="100" w:type="dxa"/>
+        <w:left w:w="100" w:type="dxa"/>
+        <w:bottom w:w="100" w:type="dxa"/>
+        <w:right w:w="100" w:type="dxa"/>
+      </w:tblCellMar>
     </w:tblPr>
   </w:style>
   <w:style w:type="table" w:customStyle="1" w:styleId="a0">
@@ -7322,6 +6908,12 @@
     <w:tblPr>
       <w:tblStyleRowBandSize w:val="1"/>
       <w:tblStyleColBandSize w:val="1"/>
+      <w:tblCellMar>
+        <w:top w:w="100" w:type="dxa"/>
+        <w:left w:w="100" w:type="dxa"/>
+        <w:bottom w:w="100" w:type="dxa"/>
+        <w:right w:w="100" w:type="dxa"/>
+      </w:tblCellMar>
     </w:tblPr>
   </w:style>
   <w:style w:type="table" w:customStyle="1" w:styleId="a1">
@@ -7329,6 +6921,12 @@
     <w:tblPr>
       <w:tblStyleRowBandSize w:val="1"/>
       <w:tblStyleColBandSize w:val="1"/>
+      <w:tblCellMar>
+        <w:top w:w="100" w:type="dxa"/>
+        <w:left w:w="100" w:type="dxa"/>
+        <w:bottom w:w="100" w:type="dxa"/>
+        <w:right w:w="100" w:type="dxa"/>
+      </w:tblCellMar>
     </w:tblPr>
   </w:style>
   <w:style w:type="table" w:customStyle="1" w:styleId="a2">
@@ -7336,6 +6934,12 @@
     <w:tblPr>
       <w:tblStyleRowBandSize w:val="1"/>
       <w:tblStyleColBandSize w:val="1"/>
+      <w:tblCellMar>
+        <w:top w:w="100" w:type="dxa"/>
+        <w:left w:w="100" w:type="dxa"/>
+        <w:bottom w:w="100" w:type="dxa"/>
+        <w:right w:w="100" w:type="dxa"/>
+      </w:tblCellMar>
     </w:tblPr>
   </w:style>
   <w:style w:type="table" w:customStyle="1" w:styleId="a3">
@@ -7343,6 +6947,12 @@
     <w:tblPr>
       <w:tblStyleRowBandSize w:val="1"/>
       <w:tblStyleColBandSize w:val="1"/>
+      <w:tblCellMar>
+        <w:top w:w="100" w:type="dxa"/>
+        <w:left w:w="100" w:type="dxa"/>
+        <w:bottom w:w="100" w:type="dxa"/>
+        <w:right w:w="100" w:type="dxa"/>
+      </w:tblCellMar>
     </w:tblPr>
   </w:style>
   <w:style w:type="table" w:customStyle="1" w:styleId="a4">
@@ -7350,6 +6960,12 @@
     <w:tblPr>
       <w:tblStyleRowBandSize w:val="1"/>
       <w:tblStyleColBandSize w:val="1"/>
+      <w:tblCellMar>
+        <w:top w:w="100" w:type="dxa"/>
+        <w:left w:w="100" w:type="dxa"/>
+        <w:bottom w:w="100" w:type="dxa"/>
+        <w:right w:w="100" w:type="dxa"/>
+      </w:tblCellMar>
     </w:tblPr>
   </w:style>
   <w:style w:type="table" w:customStyle="1" w:styleId="a5">
@@ -7357,6 +6973,12 @@
     <w:tblPr>
       <w:tblStyleRowBandSize w:val="1"/>
       <w:tblStyleColBandSize w:val="1"/>
+      <w:tblCellMar>
+        <w:top w:w="100" w:type="dxa"/>
+        <w:left w:w="100" w:type="dxa"/>
+        <w:bottom w:w="100" w:type="dxa"/>
+        <w:right w:w="100" w:type="dxa"/>
+      </w:tblCellMar>
     </w:tblPr>
   </w:style>
   <w:style w:type="table" w:customStyle="1" w:styleId="a6">
@@ -7364,6 +6986,12 @@
     <w:tblPr>
       <w:tblStyleRowBandSize w:val="1"/>
       <w:tblStyleColBandSize w:val="1"/>
+      <w:tblCellMar>
+        <w:top w:w="100" w:type="dxa"/>
+        <w:left w:w="100" w:type="dxa"/>
+        <w:bottom w:w="100" w:type="dxa"/>
+        <w:right w:w="100" w:type="dxa"/>
+      </w:tblCellMar>
     </w:tblPr>
   </w:style>
   <w:style w:type="table" w:customStyle="1" w:styleId="a7">
@@ -7371,6 +6999,12 @@
     <w:tblPr>
       <w:tblStyleRowBandSize w:val="1"/>
       <w:tblStyleColBandSize w:val="1"/>
+      <w:tblCellMar>
+        <w:top w:w="100" w:type="dxa"/>
+        <w:left w:w="100" w:type="dxa"/>
+        <w:bottom w:w="100" w:type="dxa"/>
+        <w:right w:w="100" w:type="dxa"/>
+      </w:tblCellMar>
     </w:tblPr>
   </w:style>
   <w:style w:type="table" w:customStyle="1" w:styleId="a8">
@@ -7378,6 +7012,12 @@
     <w:tblPr>
       <w:tblStyleRowBandSize w:val="1"/>
       <w:tblStyleColBandSize w:val="1"/>
+      <w:tblCellMar>
+        <w:top w:w="100" w:type="dxa"/>
+        <w:left w:w="100" w:type="dxa"/>
+        <w:bottom w:w="100" w:type="dxa"/>
+        <w:right w:w="100" w:type="dxa"/>
+      </w:tblCellMar>
     </w:tblPr>
   </w:style>
   <w:style w:type="table" w:customStyle="1" w:styleId="a9">
@@ -7385,6 +7025,12 @@
     <w:tblPr>
       <w:tblStyleRowBandSize w:val="1"/>
       <w:tblStyleColBandSize w:val="1"/>
+      <w:tblCellMar>
+        <w:top w:w="100" w:type="dxa"/>
+        <w:left w:w="100" w:type="dxa"/>
+        <w:bottom w:w="100" w:type="dxa"/>
+        <w:right w:w="100" w:type="dxa"/>
+      </w:tblCellMar>
     </w:tblPr>
   </w:style>
   <w:style w:type="table" w:customStyle="1" w:styleId="aa">
@@ -7392,6 +7038,12 @@
     <w:tblPr>
       <w:tblStyleRowBandSize w:val="1"/>
       <w:tblStyleColBandSize w:val="1"/>
+      <w:tblCellMar>
+        <w:top w:w="100" w:type="dxa"/>
+        <w:left w:w="100" w:type="dxa"/>
+        <w:bottom w:w="100" w:type="dxa"/>
+        <w:right w:w="100" w:type="dxa"/>
+      </w:tblCellMar>
     </w:tblPr>
   </w:style>
   <w:style w:type="table" w:customStyle="1" w:styleId="ab">
@@ -7399,6 +7051,12 @@
     <w:tblPr>
       <w:tblStyleRowBandSize w:val="1"/>
       <w:tblStyleColBandSize w:val="1"/>
+      <w:tblCellMar>
+        <w:top w:w="100" w:type="dxa"/>
+        <w:left w:w="100" w:type="dxa"/>
+        <w:bottom w:w="100" w:type="dxa"/>
+        <w:right w:w="100" w:type="dxa"/>
+      </w:tblCellMar>
     </w:tblPr>
   </w:style>
   <w:style w:type="table" w:customStyle="1" w:styleId="ac">
@@ -7406,7 +7064,609 @@
     <w:tblPr>
       <w:tblStyleRowBandSize w:val="1"/>
       <w:tblStyleColBandSize w:val="1"/>
+      <w:tblCellMar>
+        <w:top w:w="100" w:type="dxa"/>
+        <w:left w:w="100" w:type="dxa"/>
+        <w:bottom w:w="100" w:type="dxa"/>
+        <w:right w:w="100" w:type="dxa"/>
+      </w:tblCellMar>
     </w:tblPr>
+  </w:style>
+  <w:style w:type="paragraph" w:styleId="BalloonText">
+    <w:name w:val="Balloon Text"/>
+    <w:basedOn w:val="Normal"/>
+    <w:link w:val="BalloonTextChar"/>
+    <w:uiPriority w:val="99"/>
+    <w:semiHidden/>
+    <w:unhideWhenUsed/>
+    <w:rsid w:val="002C0B95"/>
+    <w:pPr>
+      <w:spacing w:before="0" w:after="0" w:line="240" w:lineRule="auto"/>
+    </w:pPr>
+    <w:rPr>
+      <w:rFonts w:ascii="Tahoma" w:hAnsi="Tahoma" w:cs="Tahoma"/>
+      <w:sz w:val="16"/>
+      <w:szCs w:val="16"/>
+    </w:rPr>
+  </w:style>
+  <w:style w:type="character" w:customStyle="1" w:styleId="BalloonTextChar">
+    <w:name w:val="Balloon Text Char"/>
+    <w:basedOn w:val="DefaultParagraphFont"/>
+    <w:link w:val="BalloonText"/>
+    <w:uiPriority w:val="99"/>
+    <w:semiHidden/>
+    <w:rsid w:val="002C0B95"/>
+    <w:rPr>
+      <w:rFonts w:ascii="Tahoma" w:hAnsi="Tahoma" w:cs="Tahoma"/>
+      <w:sz w:val="16"/>
+      <w:szCs w:val="16"/>
+    </w:rPr>
+  </w:style>
+</w:styles>
+</file>
+
+<file path=word/stylesWithEffects.xml><?xml version="1.0" encoding="utf-8"?>
+<w:styles xmlns:wpc="http://schemas.microsoft.com/office/word/2010/wordprocessingCanvas" xmlns:mc="http://schemas.openxmlformats.org/markup-compatibility/2006" xmlns:o="urn:schemas-microsoft-com:office:office" xmlns:r="http://schemas.openxmlformats.org/officeDocument/2006/relationships" xmlns:m="http://schemas.openxmlformats.org/officeDocument/2006/math" xmlns:v="urn:schemas-microsoft-com:vml" xmlns:wp14="http://schemas.microsoft.com/office/word/2010/wordprocessingDrawing" xmlns:wp="http://schemas.openxmlformats.org/drawingml/2006/wordprocessingDrawing" xmlns:w10="urn:schemas-microsoft-com:office:word" xmlns:w="http://schemas.openxmlformats.org/wordprocessingml/2006/main" xmlns:w14="http://schemas.microsoft.com/office/word/2010/wordml" xmlns:wpg="http://schemas.microsoft.com/office/word/2010/wordprocessingGroup" xmlns:wpi="http://schemas.microsoft.com/office/word/2010/wordprocessingInk" xmlns:wne="http://schemas.microsoft.com/office/word/2006/wordml" xmlns:wps="http://schemas.microsoft.com/office/word/2010/wordprocessingShape" mc:Ignorable="w14 wp14">
+  <w:docDefaults>
+    <w:rPrDefault>
+      <w:rPr>
+        <w:rFonts w:ascii="Times New Roman" w:eastAsia="Times New Roman" w:hAnsi="Times New Roman" w:cs="Times New Roman"/>
+        <w:sz w:val="24"/>
+        <w:szCs w:val="24"/>
+        <w:lang w:eastAsia="en-US" w:bidi="ar-SA"/>
+      </w:rPr>
+    </w:rPrDefault>
+    <w:pPrDefault>
+      <w:pPr>
+        <w:spacing w:before="240" w:after="240" w:line="276" w:lineRule="auto"/>
+      </w:pPr>
+    </w:pPrDefault>
+  </w:docDefaults>
+  <w:latentStyles w:defLockedState="0" w:defUIPriority="99" w:defSemiHidden="1" w:defUnhideWhenUsed="1" w:defQFormat="0" w:count="267">
+    <w:lsdException w:name="Normal" w:semiHidden="0" w:uiPriority="0" w:unhideWhenUsed="0" w:qFormat="1"/>
+    <w:lsdException w:name="heading 1" w:semiHidden="0" w:uiPriority="9" w:unhideWhenUsed="0" w:qFormat="1"/>
+    <w:lsdException w:name="heading 2" w:uiPriority="9" w:qFormat="1"/>
+    <w:lsdException w:name="heading 3" w:uiPriority="9" w:qFormat="1"/>
+    <w:lsdException w:name="heading 4" w:uiPriority="9" w:qFormat="1"/>
+    <w:lsdException w:name="heading 5" w:uiPriority="9" w:qFormat="1"/>
+    <w:lsdException w:name="heading 6" w:uiPriority="9" w:qFormat="1"/>
+    <w:lsdException w:name="heading 7" w:uiPriority="9" w:qFormat="1"/>
+    <w:lsdException w:name="heading 8" w:uiPriority="9" w:qFormat="1"/>
+    <w:lsdException w:name="heading 9" w:uiPriority="9" w:qFormat="1"/>
+    <w:lsdException w:name="toc 1" w:uiPriority="39"/>
+    <w:lsdException w:name="toc 2" w:uiPriority="39"/>
+    <w:lsdException w:name="toc 3" w:uiPriority="39"/>
+    <w:lsdException w:name="toc 4" w:uiPriority="39"/>
+    <w:lsdException w:name="toc 5" w:uiPriority="39"/>
+    <w:lsdException w:name="toc 6" w:uiPriority="39"/>
+    <w:lsdException w:name="toc 7" w:uiPriority="39"/>
+    <w:lsdException w:name="toc 8" w:uiPriority="39"/>
+    <w:lsdException w:name="toc 9" w:uiPriority="39"/>
+    <w:lsdException w:name="caption" w:uiPriority="35" w:qFormat="1"/>
+    <w:lsdException w:name="Title" w:semiHidden="0" w:uiPriority="10" w:unhideWhenUsed="0" w:qFormat="1"/>
+    <w:lsdException w:name="Default Paragraph Font" w:uiPriority="1"/>
+    <w:lsdException w:name="Subtitle" w:semiHidden="0" w:uiPriority="11" w:unhideWhenUsed="0" w:qFormat="1"/>
+    <w:lsdException w:name="Strong" w:semiHidden="0" w:uiPriority="22" w:unhideWhenUsed="0" w:qFormat="1"/>
+    <w:lsdException w:name="Emphasis" w:semiHidden="0" w:uiPriority="20" w:unhideWhenUsed="0" w:qFormat="1"/>
+    <w:lsdException w:name="Table Grid" w:semiHidden="0" w:uiPriority="39" w:unhideWhenUsed="0"/>
+    <w:lsdException w:name="Placeholder Text" w:unhideWhenUsed="0"/>
+    <w:lsdException w:name="No Spacing" w:semiHidden="0" w:uiPriority="1" w:unhideWhenUsed="0" w:qFormat="1"/>
+    <w:lsdException w:name="Light Shading" w:semiHidden="0" w:uiPriority="60" w:unhideWhenUsed="0"/>
+    <w:lsdException w:name="Light List" w:semiHidden="0" w:uiPriority="61" w:unhideWhenUsed="0"/>
+    <w:lsdException w:name="Light Grid" w:semiHidden="0" w:uiPriority="62" w:unhideWhenUsed="0"/>
+    <w:lsdException w:name="Medium Shading 1" w:semiHidden="0" w:uiPriority="63" w:unhideWhenUsed="0"/>
+    <w:lsdException w:name="Medium Shading 2" w:semiHidden="0" w:uiPriority="64" w:unhideWhenUsed="0"/>
+    <w:lsdException w:name="Medium List 1" w:semiHidden="0" w:uiPriority="65" w:unhideWhenUsed="0"/>
+    <w:lsdException w:name="Medium List 2" w:semiHidden="0" w:uiPriority="66" w:unhideWhenUsed="0"/>
+    <w:lsdException w:name="Medium Grid 1" w:semiHidden="0" w:uiPriority="67" w:unhideWhenUsed="0"/>
+    <w:lsdException w:name="Medium Grid 2" w:semiHidden="0" w:uiPriority="68" w:unhideWhenUsed="0"/>
+    <w:lsdException w:name="Medium Grid 3" w:semiHidden="0" w:uiPriority="69" w:unhideWhenUsed="0"/>
+    <w:lsdException w:name="Dark List" w:semiHidden="0" w:uiPriority="70" w:unhideWhenUsed="0"/>
+    <w:lsdException w:name="Colorful Shading" w:semiHidden="0" w:uiPriority="71" w:unhideWhenUsed="0"/>
+    <w:lsdException w:name="Colorful List" w:semiHidden="0" w:uiPriority="72" w:unhideWhenUsed="0"/>
+    <w:lsdException w:name="Colorful Grid" w:semiHidden="0" w:uiPriority="73" w:unhideWhenUsed="0"/>
+    <w:lsdException w:name="Light Shading Accent 1" w:semiHidden="0" w:uiPriority="60" w:unhideWhenUsed="0"/>
+    <w:lsdException w:name="Light List Accent 1" w:semiHidden="0" w:uiPriority="61" w:unhideWhenUsed="0"/>
+    <w:lsdException w:name="Light Grid Accent 1" w:semiHidden="0" w:uiPriority="62" w:unhideWhenUsed="0"/>
+    <w:lsdException w:name="Medium Shading 1 Accent 1" w:semiHidden="0" w:uiPriority="63" w:unhideWhenUsed="0"/>
+    <w:lsdException w:name="Medium Shading 2 Accent 1" w:semiHidden="0" w:uiPriority="64" w:unhideWhenUsed="0"/>
+    <w:lsdException w:name="Medium List 1 Accent 1" w:semiHidden="0" w:uiPriority="65" w:unhideWhenUsed="0"/>
+    <w:lsdException w:name="Revision" w:unhideWhenUsed="0"/>
+    <w:lsdException w:name="List Paragraph" w:semiHidden="0" w:uiPriority="34" w:unhideWhenUsed="0" w:qFormat="1"/>
+    <w:lsdException w:name="Quote" w:semiHidden="0" w:uiPriority="29" w:unhideWhenUsed="0" w:qFormat="1"/>
+    <w:lsdException w:name="Intense Quote" w:semiHidden="0" w:uiPriority="30" w:unhideWhenUsed="0" w:qFormat="1"/>
+    <w:lsdException w:name="Medium List 2 Accent 1" w:semiHidden="0" w:uiPriority="66" w:unhideWhenUsed="0"/>
+    <w:lsdException w:name="Medium Grid 1 Accent 1" w:semiHidden="0" w:uiPriority="67" w:unhideWhenUsed="0"/>
+    <w:lsdException w:name="Medium Grid 2 Accent 1" w:semiHidden="0" w:uiPriority="68" w:unhideWhenUsed="0"/>
+    <w:lsdException w:name="Medium Grid 3 Accent 1" w:semiHidden="0" w:uiPriority="69" w:unhideWhenUsed="0"/>
+    <w:lsdException w:name="Dark List Accent 1" w:semiHidden="0" w:uiPriority="70" w:unhideWhenUsed="0"/>
+    <w:lsdException w:name="Colorful Shading Accent 1" w:semiHidden="0" w:uiPriority="71" w:unhideWhenUsed="0"/>
+    <w:lsdException w:name="Colorful List Accent 1" w:semiHidden="0" w:uiPriority="72" w:unhideWhenUsed="0"/>
+    <w:lsdException w:name="Colorful Grid Accent 1" w:semiHidden="0" w:uiPriority="73" w:unhideWhenUsed="0"/>
+    <w:lsdException w:name="Light Shading Accent 2" w:semiHidden="0" w:uiPriority="60" w:unhideWhenUsed="0"/>
+    <w:lsdException w:name="Light List Accent 2" w:semiHidden="0" w:uiPriority="61" w:unhideWhenUsed="0"/>
+    <w:lsdException w:name="Light Grid Accent 2" w:semiHidden="0" w:uiPriority="62" w:unhideWhenUsed="0"/>
+    <w:lsdException w:name="Medium Shading 1 Accent 2" w:semiHidden="0" w:uiPriority="63" w:unhideWhenUsed="0"/>
+    <w:lsdException w:name="Medium Shading 2 Accent 2" w:semiHidden="0" w:uiPriority="64" w:unhideWhenUsed="0"/>
+    <w:lsdException w:name="Medium List 1 Accent 2" w:semiHidden="0" w:uiPriority="65" w:unhideWhenUsed="0"/>
+    <w:lsdException w:name="Medium List 2 Accent 2" w:semiHidden="0" w:uiPriority="66" w:unhideWhenUsed="0"/>
+    <w:lsdException w:name="Medium Grid 1 Accent 2" w:semiHidden="0" w:uiPriority="67" w:unhideWhenUsed="0"/>
+    <w:lsdException w:name="Medium Grid 2 Accent 2" w:semiHidden="0" w:uiPriority="68" w:unhideWhenUsed="0"/>
+    <w:lsdException w:name="Medium Grid 3 Accent 2" w:semiHidden="0" w:uiPriority="69" w:unhideWhenUsed="0"/>
+    <w:lsdException w:name="Dark List Accent 2" w:semiHidden="0" w:uiPriority="70" w:unhideWhenUsed="0"/>
+    <w:lsdException w:name="Colorful Shading Accent 2" w:semiHidden="0" w:uiPriority="71" w:unhideWhenUsed="0"/>
+    <w:lsdException w:name="Colorful List Accent 2" w:semiHidden="0" w:uiPriority="72" w:unhideWhenUsed="0"/>
+    <w:lsdException w:name="Colorful Grid Accent 2" w:semiHidden="0" w:uiPriority="73" w:unhideWhenUsed="0"/>
+    <w:lsdException w:name="Light Shading Accent 3" w:semiHidden="0" w:uiPriority="60" w:unhideWhenUsed="0"/>
+    <w:lsdException w:name="Light List Accent 3" w:semiHidden="0" w:uiPriority="61" w:unhideWhenUsed="0"/>
+    <w:lsdException w:name="Light Grid Accent 3" w:semiHidden="0" w:uiPriority="62" w:unhideWhenUsed="0"/>
+    <w:lsdException w:name="Medium Shading 1 Accent 3" w:semiHidden="0" w:uiPriority="63" w:unhideWhenUsed="0"/>
+    <w:lsdException w:name="Medium Shading 2 Accent 3" w:semiHidden="0" w:uiPriority="64" w:unhideWhenUsed="0"/>
+    <w:lsdException w:name="Medium List 1 Accent 3" w:semiHidden="0" w:uiPriority="65" w:unhideWhenUsed="0"/>
+    <w:lsdException w:name="Medium List 2 Accent 3" w:semiHidden="0" w:uiPriority="66" w:unhideWhenUsed="0"/>
+    <w:lsdException w:name="Medium Grid 1 Accent 3" w:semiHidden="0" w:uiPriority="67" w:unhideWhenUsed="0"/>
+    <w:lsdException w:name="Medium Grid 2 Accent 3" w:semiHidden="0" w:uiPriority="68" w:unhideWhenUsed="0"/>
+    <w:lsdException w:name="Medium Grid 3 Accent 3" w:semiHidden="0" w:uiPriority="69" w:unhideWhenUsed="0"/>
+    <w:lsdException w:name="Dark List Accent 3" w:semiHidden="0" w:uiPriority="70" w:unhideWhenUsed="0"/>
+    <w:lsdException w:name="Colorful Shading Accent 3" w:semiHidden="0" w:uiPriority="71" w:unhideWhenUsed="0"/>
+    <w:lsdException w:name="Colorful List Accent 3" w:semiHidden="0" w:uiPriority="72" w:unhideWhenUsed="0"/>
+    <w:lsdException w:name="Colorful Grid Accent 3" w:semiHidden="0" w:uiPriority="73" w:unhideWhenUsed="0"/>
+    <w:lsdException w:name="Light Shading Accent 4" w:semiHidden="0" w:uiPriority="60" w:unhideWhenUsed="0"/>
+    <w:lsdException w:name="Light List Accent 4" w:semiHidden="0" w:uiPriority="61" w:unhideWhenUsed="0"/>
+    <w:lsdException w:name="Light Grid Accent 4" w:semiHidden="0" w:uiPriority="62" w:unhideWhenUsed="0"/>
+    <w:lsdException w:name="Medium Shading 1 Accent 4" w:semiHidden="0" w:uiPriority="63" w:unhideWhenUsed="0"/>
+    <w:lsdException w:name="Medium Shading 2 Accent 4" w:semiHidden="0" w:uiPriority="64" w:unhideWhenUsed="0"/>
+    <w:lsdException w:name="Medium List 1 Accent 4" w:semiHidden="0" w:uiPriority="65" w:unhideWhenUsed="0"/>
+    <w:lsdException w:name="Medium List 2 Accent 4" w:semiHidden="0" w:uiPriority="66" w:unhideWhenUsed="0"/>
+    <w:lsdException w:name="Medium Grid 1 Accent 4" w:semiHidden="0" w:uiPriority="67" w:unhideWhenUsed="0"/>
+    <w:lsdException w:name="Medium Grid 2 Accent 4" w:semiHidden="0" w:uiPriority="68" w:unhideWhenUsed="0"/>
+    <w:lsdException w:name="Medium Grid 3 Accent 4" w:semiHidden="0" w:uiPriority="69" w:unhideWhenUsed="0"/>
+    <w:lsdException w:name="Dark List Accent 4" w:semiHidden="0" w:uiPriority="70" w:unhideWhenUsed="0"/>
+    <w:lsdException w:name="Colorful Shading Accent 4" w:semiHidden="0" w:uiPriority="71" w:unhideWhenUsed="0"/>
+    <w:lsdException w:name="Colorful List Accent 4" w:semiHidden="0" w:uiPriority="72" w:unhideWhenUsed="0"/>
+    <w:lsdException w:name="Colorful Grid Accent 4" w:semiHidden="0" w:uiPriority="73" w:unhideWhenUsed="0"/>
+    <w:lsdException w:name="Light Shading Accent 5" w:semiHidden="0" w:uiPriority="60" w:unhideWhenUsed="0"/>
+    <w:lsdException w:name="Light List Accent 5" w:semiHidden="0" w:uiPriority="61" w:unhideWhenUsed="0"/>
+    <w:lsdException w:name="Light Grid Accent 5" w:semiHidden="0" w:uiPriority="62" w:unhideWhenUsed="0"/>
+    <w:lsdException w:name="Medium Shading 1 Accent 5" w:semiHidden="0" w:uiPriority="63" w:unhideWhenUsed="0"/>
+    <w:lsdException w:name="Medium Shading 2 Accent 5" w:semiHidden="0" w:uiPriority="64" w:unhideWhenUsed="0"/>
+    <w:lsdException w:name="Medium List 1 Accent 5" w:semiHidden="0" w:uiPriority="65" w:unhideWhenUsed="0"/>
+    <w:lsdException w:name="Medium List 2 Accent 5" w:semiHidden="0" w:uiPriority="66" w:unhideWhenUsed="0"/>
+    <w:lsdException w:name="Medium Grid 1 Accent 5" w:semiHidden="0" w:uiPriority="67" w:unhideWhenUsed="0"/>
+    <w:lsdException w:name="Medium Grid 2 Accent 5" w:semiHidden="0" w:uiPriority="68" w:unhideWhenUsed="0"/>
+    <w:lsdException w:name="Medium Grid 3 Accent 5" w:semiHidden="0" w:uiPriority="69" w:unhideWhenUsed="0"/>
+    <w:lsdException w:name="Dark List Accent 5" w:semiHidden="0" w:uiPriority="70" w:unhideWhenUsed="0"/>
+    <w:lsdException w:name="Colorful Shading Accent 5" w:semiHidden="0" w:uiPriority="71" w:unhideWhenUsed="0"/>
+    <w:lsdException w:name="Colorful List Accent 5" w:semiHidden="0" w:uiPriority="72" w:unhideWhenUsed="0"/>
+    <w:lsdException w:name="Colorful Grid Accent 5" w:semiHidden="0" w:uiPriority="73" w:unhideWhenUsed="0"/>
+    <w:lsdException w:name="Light Shading Accent 6" w:semiHidden="0" w:uiPriority="60" w:unhideWhenUsed="0"/>
+    <w:lsdException w:name="Light List Accent 6" w:semiHidden="0" w:uiPriority="61" w:unhideWhenUsed="0"/>
+    <w:lsdException w:name="Light Grid Accent 6" w:semiHidden="0" w:uiPriority="62" w:unhideWhenUsed="0"/>
+    <w:lsdException w:name="Medium Shading 1 Accent 6" w:semiHidden="0" w:uiPriority="63" w:unhideWhenUsed="0"/>
+    <w:lsdException w:name="Medium Shading 2 Accent 6" w:semiHidden="0" w:uiPriority="64" w:unhideWhenUsed="0"/>
+    <w:lsdException w:name="Medium List 1 Accent 6" w:semiHidden="0" w:uiPriority="65" w:unhideWhenUsed="0"/>
+    <w:lsdException w:name="Medium List 2 Accent 6" w:semiHidden="0" w:uiPriority="66" w:unhideWhenUsed="0"/>
+    <w:lsdException w:name="Medium Grid 1 Accent 6" w:semiHidden="0" w:uiPriority="67" w:unhideWhenUsed="0"/>
+    <w:lsdException w:name="Medium Grid 2 Accent 6" w:semiHidden="0" w:uiPriority="68" w:unhideWhenUsed="0"/>
+    <w:lsdException w:name="Medium Grid 3 Accent 6" w:semiHidden="0" w:uiPriority="69" w:unhideWhenUsed="0"/>
+    <w:lsdException w:name="Dark List Accent 6" w:semiHidden="0" w:uiPriority="70" w:unhideWhenUsed="0"/>
+    <w:lsdException w:name="Colorful Shading Accent 6" w:semiHidden="0" w:uiPriority="71" w:unhideWhenUsed="0"/>
+    <w:lsdException w:name="Colorful List Accent 6" w:semiHidden="0" w:uiPriority="72" w:unhideWhenUsed="0"/>
+    <w:lsdException w:name="Colorful Grid Accent 6" w:semiHidden="0" w:uiPriority="73" w:unhideWhenUsed="0"/>
+    <w:lsdException w:name="Subtle Emphasis" w:semiHidden="0" w:uiPriority="19" w:unhideWhenUsed="0" w:qFormat="1"/>
+    <w:lsdException w:name="Intense Emphasis" w:semiHidden="0" w:uiPriority="21" w:unhideWhenUsed="0" w:qFormat="1"/>
+    <w:lsdException w:name="Subtle Reference" w:semiHidden="0" w:uiPriority="31" w:unhideWhenUsed="0" w:qFormat="1"/>
+    <w:lsdException w:name="Intense Reference" w:semiHidden="0" w:uiPriority="32" w:unhideWhenUsed="0" w:qFormat="1"/>
+    <w:lsdException w:name="Book Title" w:semiHidden="0" w:uiPriority="33" w:unhideWhenUsed="0" w:qFormat="1"/>
+    <w:lsdException w:name="Bibliography" w:uiPriority="37"/>
+    <w:lsdException w:name="TOC Heading" w:uiPriority="39" w:qFormat="1"/>
+  </w:latentStyles>
+  <w:style w:type="paragraph" w:default="1" w:styleId="Normal">
+    <w:name w:val="Normal"/>
+    <w:qFormat/>
+  </w:style>
+  <w:style w:type="paragraph" w:styleId="Heading1">
+    <w:name w:val="heading 1"/>
+    <w:basedOn w:val="Normal"/>
+    <w:next w:val="Normal"/>
+    <w:uiPriority w:val="9"/>
+    <w:qFormat/>
+    <w:pPr>
+      <w:keepNext/>
+      <w:keepLines/>
+      <w:spacing w:before="0" w:after="0" w:line="240" w:lineRule="auto"/>
+      <w:ind w:left="720" w:hanging="360"/>
+      <w:outlineLvl w:val="0"/>
+    </w:pPr>
+    <w:rPr>
+      <w:color w:val="0B5394"/>
+      <w:sz w:val="40"/>
+      <w:szCs w:val="40"/>
+    </w:rPr>
+  </w:style>
+  <w:style w:type="paragraph" w:styleId="Heading2">
+    <w:name w:val="heading 2"/>
+    <w:basedOn w:val="Normal"/>
+    <w:next w:val="Normal"/>
+    <w:uiPriority w:val="9"/>
+    <w:unhideWhenUsed/>
+    <w:qFormat/>
+    <w:pPr>
+      <w:keepNext/>
+      <w:keepLines/>
+      <w:spacing w:before="360" w:after="120"/>
+      <w:outlineLvl w:val="1"/>
+    </w:pPr>
+    <w:rPr>
+      <w:b/>
+      <w:bCs/>
+      <w:color w:val="0B5394"/>
+      <w:sz w:val="32"/>
+      <w:szCs w:val="32"/>
+    </w:rPr>
+  </w:style>
+  <w:style w:type="paragraph" w:styleId="Heading3">
+    <w:name w:val="heading 3"/>
+    <w:basedOn w:val="Normal"/>
+    <w:next w:val="Normal"/>
+    <w:uiPriority w:val="9"/>
+    <w:semiHidden/>
+    <w:unhideWhenUsed/>
+    <w:qFormat/>
+    <w:pPr>
+      <w:keepNext/>
+      <w:keepLines/>
+      <w:spacing w:before="320" w:after="80"/>
+      <w:outlineLvl w:val="2"/>
+    </w:pPr>
+    <w:rPr>
+      <w:sz w:val="28"/>
+      <w:szCs w:val="28"/>
+    </w:rPr>
+  </w:style>
+  <w:style w:type="paragraph" w:styleId="Heading4">
+    <w:name w:val="heading 4"/>
+    <w:basedOn w:val="Normal"/>
+    <w:next w:val="Normal"/>
+    <w:uiPriority w:val="9"/>
+    <w:semiHidden/>
+    <w:unhideWhenUsed/>
+    <w:qFormat/>
+    <w:pPr>
+      <w:keepNext/>
+      <w:keepLines/>
+      <w:spacing w:before="280" w:after="80"/>
+      <w:outlineLvl w:val="3"/>
+    </w:pPr>
+    <w:rPr>
+      <w:color w:val="666666"/>
+    </w:rPr>
+  </w:style>
+  <w:style w:type="paragraph" w:styleId="Heading5">
+    <w:name w:val="heading 5"/>
+    <w:basedOn w:val="Normal"/>
+    <w:next w:val="Normal"/>
+    <w:uiPriority w:val="9"/>
+    <w:semiHidden/>
+    <w:unhideWhenUsed/>
+    <w:qFormat/>
+    <w:pPr>
+      <w:keepNext/>
+      <w:keepLines/>
+      <w:spacing w:after="80"/>
+      <w:outlineLvl w:val="4"/>
+    </w:pPr>
+    <w:rPr>
+      <w:color w:val="666666"/>
+      <w:sz w:val="22"/>
+      <w:szCs w:val="22"/>
+    </w:rPr>
+  </w:style>
+  <w:style w:type="paragraph" w:styleId="Heading6">
+    <w:name w:val="heading 6"/>
+    <w:basedOn w:val="Normal"/>
+    <w:next w:val="Normal"/>
+    <w:uiPriority w:val="9"/>
+    <w:semiHidden/>
+    <w:unhideWhenUsed/>
+    <w:qFormat/>
+    <w:pPr>
+      <w:keepNext/>
+      <w:keepLines/>
+      <w:spacing w:after="80"/>
+      <w:outlineLvl w:val="5"/>
+    </w:pPr>
+    <w:rPr>
+      <w:i/>
+      <w:iCs/>
+      <w:color w:val="666666"/>
+      <w:sz w:val="22"/>
+      <w:szCs w:val="22"/>
+    </w:rPr>
+  </w:style>
+  <w:style w:type="character" w:default="1" w:styleId="DefaultParagraphFont">
+    <w:name w:val="Default Paragraph Font"/>
+    <w:uiPriority w:val="1"/>
+    <w:semiHidden/>
+    <w:unhideWhenUsed/>
+  </w:style>
+  <w:style w:type="table" w:default="1" w:styleId="TableNormal">
+    <w:name w:val="Normal Table"/>
+    <w:uiPriority w:val="99"/>
+    <w:semiHidden/>
+    <w:unhideWhenUsed/>
+    <w:tblPr>
+      <w:tblInd w:w="0" w:type="dxa"/>
+      <w:tblCellMar>
+        <w:top w:w="0" w:type="dxa"/>
+        <w:left w:w="108" w:type="dxa"/>
+        <w:bottom w:w="0" w:type="dxa"/>
+        <w:right w:w="108" w:type="dxa"/>
+      </w:tblCellMar>
+    </w:tblPr>
+  </w:style>
+  <w:style w:type="numbering" w:default="1" w:styleId="NoList">
+    <w:name w:val="No List"/>
+    <w:uiPriority w:val="99"/>
+    <w:semiHidden/>
+    <w:unhideWhenUsed/>
+  </w:style>
+  <w:style w:type="table" w:customStyle="1" w:styleId="TableNormal0">
+    <w:name w:val="TableNormal"/>
+    <w:tblPr>
+      <w:tblCellMar>
+        <w:top w:w="100" w:type="dxa"/>
+        <w:left w:w="100" w:type="dxa"/>
+        <w:bottom w:w="100" w:type="dxa"/>
+        <w:right w:w="100" w:type="dxa"/>
+      </w:tblCellMar>
+    </w:tblPr>
+  </w:style>
+  <w:style w:type="paragraph" w:styleId="Title">
+    <w:name w:val="Title"/>
+    <w:basedOn w:val="Normal"/>
+    <w:next w:val="Normal"/>
+    <w:uiPriority w:val="10"/>
+    <w:qFormat/>
+    <w:pPr>
+      <w:keepNext/>
+      <w:keepLines/>
+      <w:spacing w:before="0" w:after="60"/>
+    </w:pPr>
+    <w:rPr>
+      <w:sz w:val="52"/>
+      <w:szCs w:val="52"/>
+    </w:rPr>
+  </w:style>
+  <w:style w:type="paragraph" w:styleId="Subtitle">
+    <w:name w:val="Subtitle"/>
+    <w:basedOn w:val="Normal"/>
+    <w:next w:val="Normal"/>
+    <w:uiPriority w:val="11"/>
+    <w:qFormat/>
+    <w:pPr>
+      <w:keepNext/>
+      <w:keepLines/>
+      <w:spacing w:before="0" w:after="320"/>
+    </w:pPr>
+    <w:rPr>
+      <w:rFonts w:ascii="Arial" w:eastAsia="Arial" w:hAnsi="Arial" w:cs="Arial"/>
+      <w:color w:val="666666"/>
+      <w:sz w:val="30"/>
+      <w:szCs w:val="30"/>
+    </w:rPr>
+  </w:style>
+  <w:style w:type="table" w:customStyle="1" w:styleId="a">
+    <w:basedOn w:val="TableNormal0"/>
+    <w:tblPr>
+      <w:tblStyleRowBandSize w:val="1"/>
+      <w:tblStyleColBandSize w:val="1"/>
+      <w:tblCellMar>
+        <w:top w:w="100" w:type="dxa"/>
+        <w:left w:w="100" w:type="dxa"/>
+        <w:bottom w:w="100" w:type="dxa"/>
+        <w:right w:w="100" w:type="dxa"/>
+      </w:tblCellMar>
+    </w:tblPr>
+  </w:style>
+  <w:style w:type="table" w:customStyle="1" w:styleId="a0">
+    <w:basedOn w:val="TableNormal0"/>
+    <w:tblPr>
+      <w:tblStyleRowBandSize w:val="1"/>
+      <w:tblStyleColBandSize w:val="1"/>
+      <w:tblCellMar>
+        <w:top w:w="100" w:type="dxa"/>
+        <w:left w:w="100" w:type="dxa"/>
+        <w:bottom w:w="100" w:type="dxa"/>
+        <w:right w:w="100" w:type="dxa"/>
+      </w:tblCellMar>
+    </w:tblPr>
+  </w:style>
+  <w:style w:type="table" w:customStyle="1" w:styleId="a1">
+    <w:basedOn w:val="TableNormal0"/>
+    <w:tblPr>
+      <w:tblStyleRowBandSize w:val="1"/>
+      <w:tblStyleColBandSize w:val="1"/>
+      <w:tblCellMar>
+        <w:top w:w="100" w:type="dxa"/>
+        <w:left w:w="100" w:type="dxa"/>
+        <w:bottom w:w="100" w:type="dxa"/>
+        <w:right w:w="100" w:type="dxa"/>
+      </w:tblCellMar>
+    </w:tblPr>
+  </w:style>
+  <w:style w:type="table" w:customStyle="1" w:styleId="a2">
+    <w:basedOn w:val="TableNormal0"/>
+    <w:tblPr>
+      <w:tblStyleRowBandSize w:val="1"/>
+      <w:tblStyleColBandSize w:val="1"/>
+      <w:tblCellMar>
+        <w:top w:w="100" w:type="dxa"/>
+        <w:left w:w="100" w:type="dxa"/>
+        <w:bottom w:w="100" w:type="dxa"/>
+        <w:right w:w="100" w:type="dxa"/>
+      </w:tblCellMar>
+    </w:tblPr>
+  </w:style>
+  <w:style w:type="table" w:customStyle="1" w:styleId="a3">
+    <w:basedOn w:val="TableNormal0"/>
+    <w:tblPr>
+      <w:tblStyleRowBandSize w:val="1"/>
+      <w:tblStyleColBandSize w:val="1"/>
+      <w:tblCellMar>
+        <w:top w:w="100" w:type="dxa"/>
+        <w:left w:w="100" w:type="dxa"/>
+        <w:bottom w:w="100" w:type="dxa"/>
+        <w:right w:w="100" w:type="dxa"/>
+      </w:tblCellMar>
+    </w:tblPr>
+  </w:style>
+  <w:style w:type="table" w:customStyle="1" w:styleId="a4">
+    <w:basedOn w:val="TableNormal0"/>
+    <w:tblPr>
+      <w:tblStyleRowBandSize w:val="1"/>
+      <w:tblStyleColBandSize w:val="1"/>
+      <w:tblCellMar>
+        <w:top w:w="100" w:type="dxa"/>
+        <w:left w:w="100" w:type="dxa"/>
+        <w:bottom w:w="100" w:type="dxa"/>
+        <w:right w:w="100" w:type="dxa"/>
+      </w:tblCellMar>
+    </w:tblPr>
+  </w:style>
+  <w:style w:type="table" w:customStyle="1" w:styleId="a5">
+    <w:basedOn w:val="TableNormal0"/>
+    <w:tblPr>
+      <w:tblStyleRowBandSize w:val="1"/>
+      <w:tblStyleColBandSize w:val="1"/>
+      <w:tblCellMar>
+        <w:top w:w="100" w:type="dxa"/>
+        <w:left w:w="100" w:type="dxa"/>
+        <w:bottom w:w="100" w:type="dxa"/>
+        <w:right w:w="100" w:type="dxa"/>
+      </w:tblCellMar>
+    </w:tblPr>
+  </w:style>
+  <w:style w:type="table" w:customStyle="1" w:styleId="a6">
+    <w:basedOn w:val="TableNormal0"/>
+    <w:tblPr>
+      <w:tblStyleRowBandSize w:val="1"/>
+      <w:tblStyleColBandSize w:val="1"/>
+      <w:tblCellMar>
+        <w:top w:w="100" w:type="dxa"/>
+        <w:left w:w="100" w:type="dxa"/>
+        <w:bottom w:w="100" w:type="dxa"/>
+        <w:right w:w="100" w:type="dxa"/>
+      </w:tblCellMar>
+    </w:tblPr>
+  </w:style>
+  <w:style w:type="table" w:customStyle="1" w:styleId="a7">
+    <w:basedOn w:val="TableNormal0"/>
+    <w:tblPr>
+      <w:tblStyleRowBandSize w:val="1"/>
+      <w:tblStyleColBandSize w:val="1"/>
+      <w:tblCellMar>
+        <w:top w:w="100" w:type="dxa"/>
+        <w:left w:w="100" w:type="dxa"/>
+        <w:bottom w:w="100" w:type="dxa"/>
+        <w:right w:w="100" w:type="dxa"/>
+      </w:tblCellMar>
+    </w:tblPr>
+  </w:style>
+  <w:style w:type="table" w:customStyle="1" w:styleId="a8">
+    <w:basedOn w:val="TableNormal0"/>
+    <w:tblPr>
+      <w:tblStyleRowBandSize w:val="1"/>
+      <w:tblStyleColBandSize w:val="1"/>
+      <w:tblCellMar>
+        <w:top w:w="100" w:type="dxa"/>
+        <w:left w:w="100" w:type="dxa"/>
+        <w:bottom w:w="100" w:type="dxa"/>
+        <w:right w:w="100" w:type="dxa"/>
+      </w:tblCellMar>
+    </w:tblPr>
+  </w:style>
+  <w:style w:type="table" w:customStyle="1" w:styleId="a9">
+    <w:basedOn w:val="TableNormal0"/>
+    <w:tblPr>
+      <w:tblStyleRowBandSize w:val="1"/>
+      <w:tblStyleColBandSize w:val="1"/>
+      <w:tblCellMar>
+        <w:top w:w="100" w:type="dxa"/>
+        <w:left w:w="100" w:type="dxa"/>
+        <w:bottom w:w="100" w:type="dxa"/>
+        <w:right w:w="100" w:type="dxa"/>
+      </w:tblCellMar>
+    </w:tblPr>
+  </w:style>
+  <w:style w:type="table" w:customStyle="1" w:styleId="aa">
+    <w:basedOn w:val="TableNormal0"/>
+    <w:tblPr>
+      <w:tblStyleRowBandSize w:val="1"/>
+      <w:tblStyleColBandSize w:val="1"/>
+      <w:tblCellMar>
+        <w:top w:w="100" w:type="dxa"/>
+        <w:left w:w="100" w:type="dxa"/>
+        <w:bottom w:w="100" w:type="dxa"/>
+        <w:right w:w="100" w:type="dxa"/>
+      </w:tblCellMar>
+    </w:tblPr>
+  </w:style>
+  <w:style w:type="table" w:customStyle="1" w:styleId="ab">
+    <w:basedOn w:val="TableNormal0"/>
+    <w:tblPr>
+      <w:tblStyleRowBandSize w:val="1"/>
+      <w:tblStyleColBandSize w:val="1"/>
+      <w:tblCellMar>
+        <w:top w:w="100" w:type="dxa"/>
+        <w:left w:w="100" w:type="dxa"/>
+        <w:bottom w:w="100" w:type="dxa"/>
+        <w:right w:w="100" w:type="dxa"/>
+      </w:tblCellMar>
+    </w:tblPr>
+  </w:style>
+  <w:style w:type="table" w:customStyle="1" w:styleId="ac">
+    <w:basedOn w:val="TableNormal0"/>
+    <w:tblPr>
+      <w:tblStyleRowBandSize w:val="1"/>
+      <w:tblStyleColBandSize w:val="1"/>
+      <w:tblCellMar>
+        <w:top w:w="100" w:type="dxa"/>
+        <w:left w:w="100" w:type="dxa"/>
+        <w:bottom w:w="100" w:type="dxa"/>
+        <w:right w:w="100" w:type="dxa"/>
+      </w:tblCellMar>
+    </w:tblPr>
+  </w:style>
+  <w:style w:type="paragraph" w:styleId="BalloonText">
+    <w:name w:val="Balloon Text"/>
+    <w:basedOn w:val="Normal"/>
+    <w:link w:val="BalloonTextChar"/>
+    <w:uiPriority w:val="99"/>
+    <w:semiHidden/>
+    <w:unhideWhenUsed/>
+    <w:rsid w:val="002C0B95"/>
+    <w:pPr>
+      <w:spacing w:before="0" w:after="0" w:line="240" w:lineRule="auto"/>
+    </w:pPr>
+    <w:rPr>
+      <w:rFonts w:ascii="Tahoma" w:hAnsi="Tahoma" w:cs="Tahoma"/>
+      <w:sz w:val="16"/>
+      <w:szCs w:val="16"/>
+    </w:rPr>
+  </w:style>
+  <w:style w:type="character" w:customStyle="1" w:styleId="BalloonTextChar">
+    <w:name w:val="Balloon Text Char"/>
+    <w:basedOn w:val="DefaultParagraphFont"/>
+    <w:link w:val="BalloonText"/>
+    <w:uiPriority w:val="99"/>
+    <w:semiHidden/>
+    <w:rsid w:val="002C0B95"/>
+    <w:rPr>
+      <w:rFonts w:ascii="Tahoma" w:hAnsi="Tahoma" w:cs="Tahoma"/>
+      <w:sz w:val="16"/>
+      <w:szCs w:val="16"/>
+    </w:rPr>
   </w:style>
 </w:styles>
 </file>

</xml_diff>